<commit_message>
feat: add LLM integration module for intelligent analysis and include new sample documents.
</commit_message>
<xml_diff>
--- a/samples/JIWE_Template.docx
+++ b/samples/JIWE_Template.docx
@@ -1842,6 +1842,7 @@
         <w:spacing w:after="150" w:line="240" w:lineRule="auto"/>
         <w:rPr>
           <w:rFonts w:ascii="Times New Roman" w:eastAsia="Times New Roman" w:hAnsi="Times New Roman" w:cs="Times New Roman"/>
+          <w:i/>
           <w:color w:val="000000" w:themeColor="text1"/>
           <w:sz w:val="20"/>
           <w:szCs w:val="20"/>
@@ -3164,16 +3165,46 @@
           <w:sz w:val="20"/>
           <w:szCs w:val="20"/>
         </w:rPr>
-        <w:t xml:space="preserve"> doesn’t have one in any manuscript , then it should automatically generate the Acknowledgement with this</w:t>
-      </w:r>
-      <w:r>
-        <w:rPr>
-          <w:rFonts w:ascii="Times New Roman" w:eastAsia="Times New Roman" w:hAnsi="Times New Roman" w:cs="Times New Roman"/>
-          <w:color w:val="000000" w:themeColor="text1"/>
-          <w:sz w:val="20"/>
-          <w:szCs w:val="20"/>
-        </w:rPr>
-        <w:t xml:space="preserve"> (highlighted in yellow)</w:t>
+        <w:t xml:space="preserve"> doesn’t have one in any </w:t>
+      </w:r>
+      <w:proofErr w:type="gramStart"/>
+      <w:r>
+        <w:rPr>
+          <w:rFonts w:ascii="Times New Roman" w:eastAsia="Times New Roman" w:hAnsi="Times New Roman" w:cs="Times New Roman"/>
+          <w:color w:val="000000" w:themeColor="text1"/>
+          <w:sz w:val="20"/>
+          <w:szCs w:val="20"/>
+        </w:rPr>
+        <w:t>manuscript ,</w:t>
+      </w:r>
+      <w:proofErr w:type="gramEnd"/>
+      <w:r>
+        <w:rPr>
+          <w:rFonts w:ascii="Times New Roman" w:eastAsia="Times New Roman" w:hAnsi="Times New Roman" w:cs="Times New Roman"/>
+          <w:color w:val="000000" w:themeColor="text1"/>
+          <w:sz w:val="20"/>
+          <w:szCs w:val="20"/>
+        </w:rPr>
+        <w:t xml:space="preserve"> then it should automatically generate the Acknowledgement with this</w:t>
+      </w:r>
+      <w:r>
+        <w:rPr>
+          <w:rFonts w:ascii="Times New Roman" w:eastAsia="Times New Roman" w:hAnsi="Times New Roman" w:cs="Times New Roman"/>
+          <w:color w:val="000000" w:themeColor="text1"/>
+          <w:sz w:val="20"/>
+          <w:szCs w:val="20"/>
+        </w:rPr>
+        <w:t xml:space="preserve"> (highlighted in yellow</w:t>
+      </w:r>
+      <w:proofErr w:type="gramStart"/>
+      <w:r>
+        <w:rPr>
+          <w:rFonts w:ascii="Times New Roman" w:eastAsia="Times New Roman" w:hAnsi="Times New Roman" w:cs="Times New Roman"/>
+          <w:color w:val="000000" w:themeColor="text1"/>
+          <w:sz w:val="20"/>
+          <w:szCs w:val="20"/>
+        </w:rPr>
+        <w:t>)</w:t>
       </w:r>
       <w:r>
         <w:rPr>
@@ -3184,6 +3215,7 @@
         </w:rPr>
         <w:t xml:space="preserve"> :</w:t>
       </w:r>
+      <w:proofErr w:type="gramEnd"/>
     </w:p>
     <w:p>
       <w:pPr>
@@ -3420,8 +3452,39 @@
           <w:szCs w:val="20"/>
         </w:rPr>
         <w:lastRenderedPageBreak/>
-        <w:t>any manuscript , then it should automatically generate the Acknowledgement with this (highlighted in yellow) :</w:t>
-      </w:r>
+        <w:t xml:space="preserve">any </w:t>
+      </w:r>
+      <w:proofErr w:type="gramStart"/>
+      <w:r>
+        <w:rPr>
+          <w:rFonts w:ascii="Times New Roman" w:eastAsia="Times New Roman" w:hAnsi="Times New Roman" w:cs="Times New Roman"/>
+          <w:color w:val="000000" w:themeColor="text1"/>
+          <w:sz w:val="20"/>
+          <w:szCs w:val="20"/>
+        </w:rPr>
+        <w:t>manuscript ,</w:t>
+      </w:r>
+      <w:proofErr w:type="gramEnd"/>
+      <w:r>
+        <w:rPr>
+          <w:rFonts w:ascii="Times New Roman" w:eastAsia="Times New Roman" w:hAnsi="Times New Roman" w:cs="Times New Roman"/>
+          <w:color w:val="000000" w:themeColor="text1"/>
+          <w:sz w:val="20"/>
+          <w:szCs w:val="20"/>
+        </w:rPr>
+        <w:t xml:space="preserve"> then it should automatically generate the Acknowledgement with this (highlighted in yellow</w:t>
+      </w:r>
+      <w:proofErr w:type="gramStart"/>
+      <w:r>
+        <w:rPr>
+          <w:rFonts w:ascii="Times New Roman" w:eastAsia="Times New Roman" w:hAnsi="Times New Roman" w:cs="Times New Roman"/>
+          <w:color w:val="000000" w:themeColor="text1"/>
+          <w:sz w:val="20"/>
+          <w:szCs w:val="20"/>
+        </w:rPr>
+        <w:t>) :</w:t>
+      </w:r>
+      <w:proofErr w:type="gramEnd"/>
       <w:r>
         <w:rPr>
           <w:rFonts w:ascii="Times New Roman" w:eastAsia="Times New Roman" w:hAnsi="Times New Roman" w:cs="Times New Roman"/>
@@ -4525,7 +4588,7 @@
       <w:pPr>
         <w:rPr>
           <w:bCs/>
-          <w:lang w:val="pt-BR"/>
+          <w:lang w:val="en-MY"/>
         </w:rPr>
       </w:pPr>
       <w:r>
@@ -4536,7 +4599,7 @@
           <w:color w:val="000000" w:themeColor="text1"/>
           <w:sz w:val="21"/>
           <w:szCs w:val="21"/>
-          <w:lang w:val="pt-BR"/>
+          <w:lang w:val="en-MY"/>
         </w:rPr>
         <w:t xml:space="preserve">BIOGRAPHIES OF AUTHORS </w:t>
       </w:r>
@@ -4548,7 +4611,7 @@
           <w:color w:val="000000" w:themeColor="text1"/>
           <w:sz w:val="21"/>
           <w:szCs w:val="21"/>
-          <w:lang w:val="pt-BR"/>
+          <w:lang w:val="en-MY"/>
         </w:rPr>
         <w:t>(10-Font size, Times New Roman)</w:t>
       </w:r>
@@ -4804,7 +4867,7 @@
                 <w:color w:val="000000" w:themeColor="text1"/>
                 <w:sz w:val="18"/>
                 <w:szCs w:val="18"/>
-                <w:lang w:val="pt-BR"/>
+                <w:lang w:val="en-MY"/>
               </w:rPr>
             </w:pPr>
           </w:p>
@@ -4816,7 +4879,7 @@
                 <w:color w:val="000000" w:themeColor="text1"/>
                 <w:sz w:val="18"/>
                 <w:szCs w:val="18"/>
-                <w:lang w:val="pt-BR"/>
+                <w:lang w:val="en-MY"/>
               </w:rPr>
             </w:pPr>
             <w:r>
@@ -4825,7 +4888,7 @@
                 <w:color w:val="000000" w:themeColor="text1"/>
                 <w:sz w:val="18"/>
                 <w:szCs w:val="18"/>
-                <w:lang w:val="pt-BR"/>
+                <w:lang w:val="en-MY"/>
               </w:rPr>
               <w:t>&lt;</w:t>
             </w:r>
@@ -4836,7 +4899,7 @@
                 <w:sz w:val="18"/>
                 <w:szCs w:val="18"/>
                 <w:highlight w:val="yellow"/>
-                <w:lang w:val="pt-BR"/>
+                <w:lang w:val="en-MY"/>
               </w:rPr>
               <w:t>write about 80 words of short biography</w:t>
             </w:r>
@@ -4846,7 +4909,7 @@
                 <w:color w:val="000000" w:themeColor="text1"/>
                 <w:sz w:val="18"/>
                 <w:szCs w:val="18"/>
-                <w:lang w:val="pt-BR"/>
+                <w:lang w:val="en-MY"/>
               </w:rPr>
               <w:t>&gt;</w:t>
             </w:r>
@@ -5151,7 +5214,7 @@
               <w:jc w:val="both"/>
               <w:rPr>
                 <w:color w:val="000000" w:themeColor="text1"/>
-                <w:lang w:val="pt-BR"/>
+                <w:lang w:val="en-MY"/>
               </w:rPr>
             </w:pPr>
           </w:p>
@@ -7866,6 +7929,7 @@
   </w:font>
   <w:font w:name="DengXian Light">
     <w:altName w:val="等线 Light"/>
+    <w:panose1 w:val="02010600030101010101"/>
     <w:charset w:val="86"/>
     <w:family w:val="auto"/>
     <w:pitch w:val="variable"/>
@@ -7909,12 +7973,14 @@
     <w:rsid w:val="003A7F38"/>
     <w:rsid w:val="003E6BB6"/>
     <w:rsid w:val="003F7B72"/>
+    <w:rsid w:val="00495134"/>
     <w:rsid w:val="005615B4"/>
     <w:rsid w:val="00782E67"/>
     <w:rsid w:val="00846EF9"/>
     <w:rsid w:val="008D7EB2"/>
     <w:rsid w:val="008E6145"/>
     <w:rsid w:val="0092355C"/>
+    <w:rsid w:val="009434CE"/>
     <w:rsid w:val="009F1D35"/>
     <w:rsid w:val="00A12926"/>
     <w:rsid w:val="00AC6C43"/>

</xml_diff>

<commit_message>
Handle title italic rule for updated JIWE template
</commit_message>
<xml_diff>
--- a/samples/JIWE_Template.docx
+++ b/samples/JIWE_Template.docx
@@ -2,199 +2,6 @@
 <file path=word/document.xml><?xml version="1.0" encoding="utf-8"?>
 <w:document xmlns:wpc="http://schemas.microsoft.com/office/word/2010/wordprocessingCanvas" xmlns:cx="http://schemas.microsoft.com/office/drawing/2014/chartex" xmlns:cx1="http://schemas.microsoft.com/office/drawing/2015/9/8/chartex" xmlns:cx2="http://schemas.microsoft.com/office/drawing/2015/10/21/chartex" xmlns:cx3="http://schemas.microsoft.com/office/drawing/2016/5/9/chartex" xmlns:cx4="http://schemas.microsoft.com/office/drawing/2016/5/10/chartex" xmlns:cx5="http://schemas.microsoft.com/office/drawing/2016/5/11/chartex" xmlns:cx6="http://schemas.microsoft.com/office/drawing/2016/5/12/chartex" xmlns:cx7="http://schemas.microsoft.com/office/drawing/2016/5/13/chartex" xmlns:cx8="http://schemas.microsoft.com/office/drawing/2016/5/14/chartex" xmlns:mc="http://schemas.openxmlformats.org/markup-compatibility/2006" xmlns:aink="http://schemas.microsoft.com/office/drawing/2016/ink" xmlns:am3d="http://schemas.microsoft.com/office/drawing/2017/model3d" xmlns:o="urn:schemas-microsoft-com:office:office" xmlns:oel="http://schemas.microsoft.com/office/2019/extlst" xmlns:r="http://schemas.openxmlformats.org/officeDocument/2006/relationships" xmlns:m="http://schemas.openxmlformats.org/officeDocument/2006/math" xmlns:v="urn:schemas-microsoft-com:vml" xmlns:wp14="http://schemas.microsoft.com/office/word/2010/wordprocessingDrawing" xmlns:wp="http://schemas.openxmlformats.org/drawingml/2006/wordprocessingDrawing" xmlns:w10="urn:schemas-microsoft-com:office:word" xmlns:w="http://schemas.openxmlformats.org/wordprocessingml/2006/main" xmlns:w14="http://schemas.microsoft.com/office/word/2010/wordml" xmlns:w15="http://schemas.microsoft.com/office/word/2012/wordml" xmlns:w16cex="http://schemas.microsoft.com/office/word/2018/wordml/cex" xmlns:w16cid="http://schemas.microsoft.com/office/word/2016/wordml/cid" xmlns:w16="http://schemas.microsoft.com/office/word/2018/wordml" xmlns:w16du="http://schemas.microsoft.com/office/word/2023/wordml/word16du" xmlns:w16sdtdh="http://schemas.microsoft.com/office/word/2020/wordml/sdtdatahash" xmlns:w16sdtfl="http://schemas.microsoft.com/office/word/2024/wordml/sdtformatlock" xmlns:w16se="http://schemas.microsoft.com/office/word/2015/wordml/symex" xmlns:wpg="http://schemas.microsoft.com/office/word/2010/wordprocessingGroup" xmlns:wpi="http://schemas.microsoft.com/office/word/2010/wordprocessingInk" xmlns:wne="http://schemas.microsoft.com/office/word/2006/wordml" xmlns:wps="http://schemas.microsoft.com/office/word/2010/wordprocessingShape" mc:Ignorable="w14 w15 w16se w16cid w16 w16cex w16sdtdh w16sdtfl w16du wp14">
   <w:body>
-    <w:sdt>
-      <w:sdtPr>
-        <w:alias w:val="Journal Name"/>
-        <w:tag w:val="jiwe:journal-header"/>
-        <w:id w:val="1830178058"/>
-      </w:sdtPr>
-      <w:sdtContent>
-        <w:p>
-          <w:pPr>
-            <w:spacing w:after="0" w:line="240" w:lineRule="auto"/>
-            <w:ind w:left="46"/>
-            <w:jc w:val="center"/>
-            <w:rPr>
-              <w:rFonts w:ascii="Palatino Linotype" w:eastAsia="Palatino Linotype" w:hAnsi="Palatino Linotype" w:cs="Palatino Linotype"/>
-              <w:b/>
-              <w:color w:val="000000" w:themeColor="text1"/>
-              <w:sz w:val="48"/>
-              <w:szCs w:val="16"/>
-              <w:lang w:eastAsia="en-MY"/>
-            </w:rPr>
-          </w:pPr>
-          <w:r>
-            <w:rPr>
-              <w:rFonts w:ascii="Palatino Linotype" w:eastAsia="Palatino Linotype" w:hAnsi="Palatino Linotype" w:cs="Palatino Linotype"/>
-              <w:bCs/>
-              <w:i/>
-              <w:iCs/>
-              <w:noProof/>
-              <w:color w:val="000000" w:themeColor="text1"/>
-              <w:lang w:eastAsia="en-MY"/>
-            </w:rPr>
-            <mc:AlternateContent>
-              <mc:Choice Requires="wpg">
-                <w:drawing>
-                  <wp:anchor distT="0" distB="0" distL="114300" distR="114300" simplePos="0" relativeHeight="251659264" behindDoc="0" locked="0" layoutInCell="1" allowOverlap="1" wp14:anchorId="606D0146" wp14:editId="50D6C8E0">
-                    <wp:simplePos x="0" y="0"/>
-                    <wp:positionH relativeFrom="margin">
-                      <wp:align>left</wp:align>
-                    </wp:positionH>
-                    <wp:positionV relativeFrom="page">
-                      <wp:posOffset>909955</wp:posOffset>
-                    </wp:positionV>
-                    <wp:extent cx="5963920" cy="88265"/>
-                    <wp:effectExtent l="0" t="0" r="0" b="0"/>
-                    <wp:wrapTopAndBottom/>
-                    <wp:docPr id="1232047645" name="Group 1232047645"/>
-                    <wp:cNvGraphicFramePr/>
-                    <a:graphic xmlns:a="http://schemas.openxmlformats.org/drawingml/2006/main">
-                      <a:graphicData uri="http://schemas.microsoft.com/office/word/2010/wordprocessingGroup">
-                        <wpg:wgp>
-                          <wpg:cNvGrpSpPr/>
-                          <wpg:grpSpPr>
-                            <a:xfrm>
-                              <a:off x="0" y="0"/>
-                              <a:ext cx="5963920" cy="88711"/>
-                              <a:chOff x="0" y="0"/>
-                              <a:chExt cx="5731510" cy="9525"/>
-                            </a:xfrm>
-                          </wpg:grpSpPr>
-                          <wps:wsp>
-                            <wps:cNvPr id="2038521869" name="Shape 6"/>
-                            <wps:cNvSpPr/>
-                            <wps:spPr>
-                              <a:xfrm>
-                                <a:off x="0" y="0"/>
-                                <a:ext cx="5731510" cy="0"/>
-                              </a:xfrm>
-                              <a:custGeom>
-                                <a:avLst/>
-                                <a:gdLst/>
-                                <a:ahLst/>
-                                <a:cxnLst/>
-                                <a:rect l="0" t="0" r="0" b="0"/>
-                                <a:pathLst>
-                                  <a:path w="5731510">
-                                    <a:moveTo>
-                                      <a:pt x="0" y="0"/>
-                                    </a:moveTo>
-                                    <a:lnTo>
-                                      <a:pt x="5731510" y="0"/>
-                                    </a:lnTo>
-                                  </a:path>
-                                </a:pathLst>
-                              </a:custGeom>
-                              <a:noFill/>
-                              <a:ln w="9525" cap="flat" cmpd="sng" algn="ctr">
-                                <a:solidFill>
-                                  <a:srgbClr val="000000"/>
-                                </a:solidFill>
-                                <a:prstDash val="solid"/>
-                                <a:round/>
-                              </a:ln>
-                              <a:effectLst/>
-                            </wps:spPr>
-                            <wps:bodyPr/>
-                          </wps:wsp>
-                        </wpg:wgp>
-                      </a:graphicData>
-                    </a:graphic>
-                    <wp14:sizeRelH relativeFrom="margin">
-                      <wp14:pctWidth>0</wp14:pctWidth>
-                    </wp14:sizeRelH>
-                    <wp14:sizeRelV relativeFrom="margin">
-                      <wp14:pctHeight>0</wp14:pctHeight>
-                    </wp14:sizeRelV>
-                  </wp:anchor>
-                </w:drawing>
-              </mc:Choice>
-              <mc:Fallback>
-                <w:pict>
-                  <v:group w14:anchorId="694F3CC1" id="Group 1232047645" o:spid="_x0000_s1026" style="position:absolute;margin-left:0;margin-top:71.65pt;width:469.6pt;height:6.95pt;z-index:251659264;mso-position-horizontal:left;mso-position-horizontal-relative:margin;mso-position-vertical-relative:page;mso-width-relative:margin;mso-height-relative:margin" coordsize="57315,95" o:gfxdata="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">
-                    <v:shape id="Shape 6" o:spid="_x0000_s1027" style="position:absolute;width:57315;height:0;visibility:visible;mso-wrap-style:square;v-text-anchor:top" coordsize="5731510,0" o:gfxdata="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" path="m,l5731510,e" filled="f">
-                      <v:path arrowok="t" textboxrect="0,0,5731510,0"/>
-                    </v:shape>
-                    <w10:wrap type="topAndBottom" anchorx="margin" anchory="page"/>
-                  </v:group>
-                </w:pict>
-              </mc:Fallback>
-            </mc:AlternateContent>
-          </w:r>
-          <w:r>
-            <w:rPr>
-              <w:rFonts w:ascii="Palatino Linotype" w:eastAsia="Palatino Linotype" w:hAnsi="Palatino Linotype" w:cs="Palatino Linotype"/>
-              <w:bCs/>
-              <w:i/>
-              <w:iCs/>
-              <w:color w:val="000000" w:themeColor="text1"/>
-              <w:sz w:val="48"/>
-              <w:szCs w:val="16"/>
-              <w:lang w:eastAsia="en-MY"/>
-            </w:rPr>
-            <w:t>(Journal Title)</w:t>
-          </w:r>
-          <w:r>
-            <w:rPr>
-              <w:rFonts w:ascii="Palatino Linotype" w:eastAsia="Palatino Linotype" w:hAnsi="Palatino Linotype" w:cs="Palatino Linotype"/>
-              <w:b/>
-              <w:color w:val="000000" w:themeColor="text1"/>
-              <w:sz w:val="48"/>
-              <w:szCs w:val="16"/>
-              <w:lang w:eastAsia="en-MY"/>
-            </w:rPr>
-            <w:t xml:space="preserve">Journal of Informatics and </w:t>
-          </w:r>
-        </w:p>
-      </w:sdtContent>
-    </w:sdt>
-    <w:sdt>
-      <w:sdtPr>
-        <w:alias w:val="Journal Name"/>
-        <w:tag w:val="jiwe:journal-header"/>
-        <w:id w:val="-590536537"/>
-      </w:sdtPr>
-      <w:sdtContent>
-        <w:p>
-          <w:pPr>
-            <w:spacing w:after="0" w:line="240" w:lineRule="auto"/>
-            <w:ind w:left="46"/>
-            <w:jc w:val="center"/>
-            <w:rPr>
-              <w:rFonts w:ascii="Palatino Linotype" w:eastAsia="Palatino Linotype" w:hAnsi="Palatino Linotype" w:cs="Palatino Linotype"/>
-              <w:b/>
-              <w:color w:val="000000" w:themeColor="text1"/>
-              <w:sz w:val="48"/>
-              <w:szCs w:val="16"/>
-              <w:lang w:eastAsia="en-MY"/>
-            </w:rPr>
-          </w:pPr>
-          <w:r>
-            <w:rPr>
-              <w:rFonts w:ascii="Palatino Linotype" w:eastAsia="Palatino Linotype" w:hAnsi="Palatino Linotype" w:cs="Palatino Linotype"/>
-              <w:b/>
-              <w:color w:val="000000" w:themeColor="text1"/>
-              <w:sz w:val="48"/>
-              <w:szCs w:val="16"/>
-              <w:lang w:eastAsia="en-MY"/>
-            </w:rPr>
-            <w:t>Web Engineering</w:t>
-          </w:r>
-          <w:r>
-            <w:rPr>
-              <w:rFonts w:ascii="Palatino Linotype" w:eastAsia="Palatino Linotype" w:hAnsi="Palatino Linotype" w:cs="Palatino Linotype"/>
-              <w:b/>
-              <w:color w:val="000000" w:themeColor="text1"/>
-              <w:sz w:val="48"/>
-              <w:szCs w:val="16"/>
-              <w:lang w:eastAsia="en-MY"/>
-            </w:rPr>
-            <w:t xml:space="preserve"> </w:t>
-          </w:r>
-        </w:p>
-      </w:sdtContent>
-    </w:sdt>
     <w:p>
       <w:pPr>
         <w:spacing w:after="0" w:line="240" w:lineRule="auto"/>
@@ -212,359 +19,458 @@
       <w:r>
         <w:rPr>
           <w:rFonts w:ascii="Palatino Linotype" w:eastAsia="Palatino Linotype" w:hAnsi="Palatino Linotype" w:cs="Palatino Linotype"/>
+          <w:noProof/>
+          <w:color w:val="000000" w:themeColor="text1"/>
+          <w:lang w:eastAsia="en-MY"/>
+        </w:rPr>
+        <mc:AlternateContent>
+          <mc:Choice Requires="wpg">
+            <w:drawing>
+              <wp:anchor distT="0" distB="0" distL="114300" distR="114300" simplePos="0" relativeHeight="251659264" behindDoc="0" locked="0" layoutInCell="1" allowOverlap="1" wp14:anchorId="606D0146" wp14:editId="50D6C8E0">
+                <wp:simplePos x="0" y="0"/>
+                <wp:positionH relativeFrom="margin">
+                  <wp:align>left</wp:align>
+                </wp:positionH>
+                <wp:positionV relativeFrom="page">
+                  <wp:posOffset>909955</wp:posOffset>
+                </wp:positionV>
+                <wp:extent cx="5963920" cy="88265"/>
+                <wp:effectExtent l="0" t="0" r="0" b="0"/>
+                <wp:wrapTopAndBottom/>
+                <wp:docPr id="1232047645" name="Group 1232047645"/>
+                <wp:cNvGraphicFramePr/>
+                <a:graphic xmlns:a="http://schemas.openxmlformats.org/drawingml/2006/main">
+                  <a:graphicData uri="http://schemas.microsoft.com/office/word/2010/wordprocessingGroup">
+                    <wpg:wgp>
+                      <wpg:cNvGrpSpPr/>
+                      <wpg:grpSpPr>
+                        <a:xfrm>
+                          <a:off x="0" y="0"/>
+                          <a:ext cx="5963920" cy="88711"/>
+                          <a:chOff x="0" y="0"/>
+                          <a:chExt cx="5731510" cy="9525"/>
+                        </a:xfrm>
+                      </wpg:grpSpPr>
+                      <wps:wsp>
+                        <wps:cNvPr id="2038521869" name="Shape 6"/>
+                        <wps:cNvSpPr/>
+                        <wps:spPr>
+                          <a:xfrm>
+                            <a:off x="0" y="0"/>
+                            <a:ext cx="5731510" cy="0"/>
+                          </a:xfrm>
+                          <a:custGeom>
+                            <a:avLst/>
+                            <a:gdLst/>
+                            <a:ahLst/>
+                            <a:cxnLst/>
+                            <a:rect l="0" t="0" r="0" b="0"/>
+                            <a:pathLst>
+                              <a:path w="5731510">
+                                <a:moveTo>
+                                  <a:pt x="0" y="0"/>
+                                </a:moveTo>
+                                <a:lnTo>
+                                  <a:pt x="5731510" y="0"/>
+                                </a:lnTo>
+                              </a:path>
+                            </a:pathLst>
+                          </a:custGeom>
+                          <a:noFill/>
+                          <a:ln w="9525" cap="flat" cmpd="sng" algn="ctr">
+                            <a:solidFill>
+                              <a:srgbClr val="000000"/>
+                            </a:solidFill>
+                            <a:prstDash val="solid"/>
+                            <a:round/>
+                          </a:ln>
+                          <a:effectLst/>
+                        </wps:spPr>
+                        <wps:bodyPr/>
+                      </wps:wsp>
+                    </wpg:wgp>
+                  </a:graphicData>
+                </a:graphic>
+                <wp14:sizeRelH relativeFrom="margin">
+                  <wp14:pctWidth>0</wp14:pctWidth>
+                </wp14:sizeRelH>
+                <wp14:sizeRelV relativeFrom="margin">
+                  <wp14:pctHeight>0</wp14:pctHeight>
+                </wp14:sizeRelV>
+              </wp:anchor>
+            </w:drawing>
+          </mc:Choice>
+          <mc:Fallback>
+            <w:pict>
+              <v:group w14:anchorId="5C502367" id="Group 1232047645" o:spid="_x0000_s1026" style="position:absolute;margin-left:0;margin-top:71.65pt;width:469.6pt;height:6.95pt;z-index:251659264;mso-position-horizontal:left;mso-position-horizontal-relative:margin;mso-position-vertical-relative:page;mso-width-relative:margin;mso-height-relative:margin" coordsize="57315,95" o:gfxdata="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">
+                <v:shape id="Shape 6" o:spid="_x0000_s1027" style="position:absolute;width:57315;height:0;visibility:visible;mso-wrap-style:square;v-text-anchor:top" coordsize="5731510,0" o:gfxdata="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" path="m,l5731510,e" filled="f">
+                  <v:path arrowok="t" textboxrect="0,0,5731510,0"/>
+                </v:shape>
+                <w10:wrap type="topAndBottom" anchorx="margin" anchory="page"/>
+              </v:group>
+            </w:pict>
+          </mc:Fallback>
+        </mc:AlternateContent>
+      </w:r>
+      <w:r>
+        <w:rPr>
+          <w:rFonts w:ascii="Palatino Linotype" w:eastAsia="Palatino Linotype" w:hAnsi="Palatino Linotype" w:cs="Palatino Linotype"/>
           <w:b/>
           <w:color w:val="000000" w:themeColor="text1"/>
           <w:sz w:val="48"/>
           <w:szCs w:val="16"/>
           <w:lang w:eastAsia="en-MY"/>
         </w:rPr>
-        <w:t>(24- Font size, bold Palatino Linotype)</w:t>
+        <w:t xml:space="preserve">Journal of Informatics and </w:t>
       </w:r>
     </w:p>
-    <w:sdt>
-      <w:sdtPr>
-        <w:alias w:val="Journal Metadata"/>
-        <w:tag w:val="jiwe:journal-metadata"/>
-        <w:id w:val="-5378511"/>
-      </w:sdtPr>
-      <w:sdtContent>
-        <w:p>
-          <w:pPr>
-            <w:tabs>
-              <w:tab w:val="right" w:pos="9026"/>
-            </w:tabs>
-            <w:spacing w:after="10" w:line="248" w:lineRule="auto"/>
-            <w:jc w:val="center"/>
-            <w:rPr>
-              <w:rFonts w:ascii="Palatino Linotype" w:eastAsia="Palatino Linotype" w:hAnsi="Palatino Linotype" w:cs="Palatino Linotype"/>
-              <w:color w:val="000000" w:themeColor="text1"/>
-              <w:lang w:eastAsia="en-MY"/>
-            </w:rPr>
-          </w:pPr>
-          <w:r>
-            <w:rPr>
-              <w:rFonts w:ascii="Calibri" w:eastAsia="Calibri" w:hAnsi="Calibri" w:cs="Calibri"/>
-              <w:noProof/>
-              <w:color w:val="000000" w:themeColor="text1"/>
-              <w:lang w:eastAsia="en-MY"/>
-            </w:rPr>
-            <mc:AlternateContent>
-              <mc:Choice Requires="wpg">
-                <w:drawing>
-                  <wp:anchor distT="0" distB="0" distL="114300" distR="114300" simplePos="0" relativeHeight="251657216" behindDoc="0" locked="0" layoutInCell="1" allowOverlap="1" wp14:anchorId="5AE5092C" wp14:editId="1F9DC7FC">
-                    <wp:simplePos x="0" y="0"/>
-                    <wp:positionH relativeFrom="margin">
-                      <wp:posOffset>0</wp:posOffset>
-                    </wp:positionH>
-                    <wp:positionV relativeFrom="paragraph">
-                      <wp:posOffset>162665</wp:posOffset>
-                    </wp:positionV>
-                    <wp:extent cx="5964072" cy="45719"/>
-                    <wp:effectExtent l="0" t="0" r="17780" b="12065"/>
-                    <wp:wrapNone/>
-                    <wp:docPr id="1418392037" name="Group 1418392037"/>
-                    <wp:cNvGraphicFramePr/>
-                    <a:graphic xmlns:a="http://schemas.openxmlformats.org/drawingml/2006/main">
-                      <a:graphicData uri="http://schemas.microsoft.com/office/word/2010/wordprocessingGroup">
-                        <wpg:wgp>
-                          <wpg:cNvGrpSpPr/>
-                          <wpg:grpSpPr>
-                            <a:xfrm flipV="1">
-                              <a:off x="0" y="0"/>
-                              <a:ext cx="5964072" cy="45719"/>
-                              <a:chOff x="0" y="0"/>
-                              <a:chExt cx="5731510" cy="20320"/>
-                            </a:xfrm>
-                          </wpg:grpSpPr>
-                          <wps:wsp>
-                            <wps:cNvPr id="925217558" name="Shape 7"/>
-                            <wps:cNvSpPr/>
-                            <wps:spPr>
-                              <a:xfrm>
-                                <a:off x="0" y="0"/>
-                                <a:ext cx="5731510" cy="0"/>
-                              </a:xfrm>
-                              <a:custGeom>
-                                <a:avLst/>
-                                <a:gdLst/>
-                                <a:ahLst/>
-                                <a:cxnLst/>
-                                <a:rect l="0" t="0" r="0" b="0"/>
-                                <a:pathLst>
-                                  <a:path w="5731510">
-                                    <a:moveTo>
-                                      <a:pt x="0" y="0"/>
-                                    </a:moveTo>
-                                    <a:lnTo>
-                                      <a:pt x="5731510" y="0"/>
-                                    </a:lnTo>
-                                  </a:path>
-                                </a:pathLst>
-                              </a:custGeom>
-                              <a:noFill/>
-                              <a:ln w="10160" cap="flat" cmpd="sng" algn="ctr">
-                                <a:solidFill>
-                                  <a:srgbClr val="000000"/>
-                                </a:solidFill>
-                                <a:prstDash val="solid"/>
-                                <a:round/>
-                              </a:ln>
-                              <a:effectLst/>
-                            </wps:spPr>
-                            <wps:bodyPr/>
-                          </wps:wsp>
-                          <wps:wsp>
-                            <wps:cNvPr id="75141815" name="Shape 8"/>
-                            <wps:cNvSpPr/>
-                            <wps:spPr>
-                              <a:xfrm>
-                                <a:off x="0" y="20320"/>
-                                <a:ext cx="5731510" cy="0"/>
-                              </a:xfrm>
-                              <a:custGeom>
-                                <a:avLst/>
-                                <a:gdLst/>
-                                <a:ahLst/>
-                                <a:cxnLst/>
-                                <a:rect l="0" t="0" r="0" b="0"/>
-                                <a:pathLst>
-                                  <a:path w="5731510">
-                                    <a:moveTo>
-                                      <a:pt x="0" y="0"/>
-                                    </a:moveTo>
-                                    <a:lnTo>
-                                      <a:pt x="5731510" y="0"/>
-                                    </a:lnTo>
-                                  </a:path>
-                                </a:pathLst>
-                              </a:custGeom>
-                              <a:noFill/>
-                              <a:ln w="10160" cap="flat" cmpd="sng" algn="ctr">
-                                <a:solidFill>
-                                  <a:srgbClr val="000000"/>
-                                </a:solidFill>
-                                <a:prstDash val="solid"/>
-                                <a:round/>
-                              </a:ln>
-                              <a:effectLst/>
-                            </wps:spPr>
-                            <wps:bodyPr/>
-                          </wps:wsp>
-                        </wpg:wgp>
-                      </a:graphicData>
-                    </a:graphic>
-                    <wp14:sizeRelH relativeFrom="margin">
-                      <wp14:pctWidth>0</wp14:pctWidth>
-                    </wp14:sizeRelH>
-                    <wp14:sizeRelV relativeFrom="margin">
-                      <wp14:pctHeight>0</wp14:pctHeight>
-                    </wp14:sizeRelV>
-                  </wp:anchor>
-                </w:drawing>
-              </mc:Choice>
-              <mc:Fallback>
-                <w:pict>
-                  <v:group w14:anchorId="25BBD277" id="Group 1418392037" o:spid="_x0000_s1026" style="position:absolute;margin-left:0;margin-top:12.8pt;width:469.6pt;height:3.6pt;flip:y;z-index:251657216;mso-position-horizontal-relative:margin;mso-width-relative:margin;mso-height-relative:margin" coordsize="57315,203" o:gfxdata="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">
-                    <v:shape id="Shape 7" o:spid="_x0000_s1027" style="position:absolute;width:57315;height:0;visibility:visible;mso-wrap-style:square;v-text-anchor:top" coordsize="5731510,0" o:gfxdata="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" path="m,l5731510,e" filled="f" strokeweight=".8pt">
-                      <v:path arrowok="t" textboxrect="0,0,5731510,0"/>
-                    </v:shape>
-                    <v:shape id="Shape 8" o:spid="_x0000_s1028" style="position:absolute;top:203;width:57315;height:0;visibility:visible;mso-wrap-style:square;v-text-anchor:top" coordsize="5731510,0" o:gfxdata="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" path="m,l5731510,e" filled="f" strokeweight=".8pt">
-                      <v:path arrowok="t" textboxrect="0,0,5731510,0"/>
-                    </v:shape>
-                    <w10:wrap anchorx="margin"/>
-                  </v:group>
-                </w:pict>
-              </mc:Fallback>
-            </mc:AlternateContent>
-          </w:r>
-          <w:r>
-            <w:rPr>
-              <w:rFonts w:ascii="Palatino Linotype" w:eastAsia="Palatino Linotype" w:hAnsi="Palatino Linotype" w:cs="Palatino Linotype"/>
-              <w:color w:val="000000" w:themeColor="text1"/>
-              <w:lang w:eastAsia="en-MY"/>
-            </w:rPr>
-            <w:t xml:space="preserve">Vol. </w:t>
-          </w:r>
-          <w:r>
-            <w:rPr>
-              <w:rFonts w:ascii="Palatino Linotype" w:eastAsia="Palatino Linotype" w:hAnsi="Palatino Linotype" w:cs="Palatino Linotype"/>
-              <w:color w:val="000000" w:themeColor="text1"/>
-              <w:lang w:eastAsia="en-MY"/>
-            </w:rPr>
-            <w:t>3</w:t>
-          </w:r>
-          <w:r>
-            <w:rPr>
-              <w:rFonts w:ascii="Palatino Linotype" w:eastAsia="Palatino Linotype" w:hAnsi="Palatino Linotype" w:cs="Palatino Linotype"/>
-              <w:color w:val="000000" w:themeColor="text1"/>
-              <w:lang w:eastAsia="en-MY"/>
-            </w:rPr>
-            <w:t xml:space="preserve"> No. </w:t>
-          </w:r>
-          <w:r>
-            <w:rPr>
-              <w:rFonts w:ascii="Palatino Linotype" w:eastAsia="Palatino Linotype" w:hAnsi="Palatino Linotype" w:cs="Palatino Linotype"/>
-              <w:color w:val="000000" w:themeColor="text1"/>
-              <w:lang w:eastAsia="en-MY"/>
-            </w:rPr>
-            <w:t>3</w:t>
-          </w:r>
-          <w:r>
-            <w:rPr>
-              <w:rFonts w:ascii="Palatino Linotype" w:eastAsia="Palatino Linotype" w:hAnsi="Palatino Linotype" w:cs="Palatino Linotype"/>
-              <w:color w:val="000000" w:themeColor="text1"/>
-              <w:lang w:eastAsia="en-MY"/>
-            </w:rPr>
-            <w:t xml:space="preserve"> (</w:t>
-          </w:r>
-          <w:r>
-            <w:rPr>
-              <w:rFonts w:ascii="Palatino Linotype" w:eastAsia="Palatino Linotype" w:hAnsi="Palatino Linotype" w:cs="Palatino Linotype"/>
-              <w:color w:val="000000" w:themeColor="text1"/>
-              <w:lang w:eastAsia="en-MY"/>
-            </w:rPr>
-            <w:t>October</w:t>
-          </w:r>
-          <w:r>
-            <w:rPr>
-              <w:rFonts w:ascii="Palatino Linotype" w:eastAsia="Palatino Linotype" w:hAnsi="Palatino Linotype" w:cs="Palatino Linotype"/>
-              <w:color w:val="000000" w:themeColor="text1"/>
-              <w:lang w:eastAsia="en-MY"/>
-            </w:rPr>
-            <w:t xml:space="preserve"> 2024)</w:t>
-          </w:r>
-          <w:r>
-            <w:rPr>
-              <w:rFonts w:ascii="Palatino Linotype" w:eastAsia="Palatino Linotype" w:hAnsi="Palatino Linotype" w:cs="Palatino Linotype"/>
-              <w:color w:val="000000" w:themeColor="text1"/>
-              <w:lang w:eastAsia="en-MY"/>
-            </w:rPr>
-            <w:t xml:space="preserve">     </w:t>
-          </w:r>
-          <w:r>
-            <w:rPr>
-              <w:rFonts w:ascii="Palatino Linotype" w:eastAsia="Palatino Linotype" w:hAnsi="Palatino Linotype" w:cs="Palatino Linotype"/>
-              <w:color w:val="000000" w:themeColor="text1"/>
-              <w:lang w:eastAsia="en-MY"/>
-            </w:rPr>
-            <w:tab/>
-          </w:r>
-          <w:proofErr w:type="spellStart"/>
-          <w:r>
-            <w:rPr>
-              <w:rFonts w:ascii="Palatino Linotype" w:eastAsia="Palatino Linotype" w:hAnsi="Palatino Linotype" w:cs="Palatino Linotype"/>
-              <w:color w:val="000000" w:themeColor="text1"/>
-              <w:lang w:eastAsia="en-MY"/>
-            </w:rPr>
-            <w:t>eISSN</w:t>
-          </w:r>
-          <w:proofErr w:type="spellEnd"/>
-          <w:r>
-            <w:rPr>
-              <w:rFonts w:ascii="Palatino Linotype" w:eastAsia="Palatino Linotype" w:hAnsi="Palatino Linotype" w:cs="Palatino Linotype"/>
-              <w:color w:val="000000" w:themeColor="text1"/>
-              <w:lang w:eastAsia="en-MY"/>
-            </w:rPr>
-            <w:t>: 2821-370X</w:t>
-          </w:r>
-        </w:p>
-      </w:sdtContent>
-    </w:sdt>
-    <w:sdt>
-      <w:sdtPr>
-        <w:alias w:val="Title"/>
-        <w:tag w:val="jiwe:title"/>
-        <w:id w:val="1301728855"/>
-      </w:sdtPr>
-      <w:sdtContent>
-        <w:p>
-          <w:pPr>
-            <w:shd w:val="clear" w:color="auto" w:fill="FFFFFF"/>
-            <w:spacing w:before="300" w:after="150" w:line="240" w:lineRule="auto"/>
-            <w:jc w:val="center"/>
-            <w:outlineLvl w:val="0"/>
-            <w:rPr>
-              <w:rFonts w:ascii="Times New Roman" w:eastAsia="Times New Roman" w:hAnsi="Times New Roman" w:cs="Times New Roman"/>
-              <w:color w:val="000000" w:themeColor="text1"/>
-              <w:kern w:val="36"/>
-              <w:sz w:val="48"/>
-              <w:szCs w:val="48"/>
-            </w:rPr>
-          </w:pPr>
-          <w:r>
-            <w:rPr>
-              <w:rFonts w:ascii="Times New Roman" w:eastAsia="Times New Roman" w:hAnsi="Times New Roman" w:cs="Times New Roman"/>
-              <w:color w:val="000000" w:themeColor="text1"/>
-              <w:kern w:val="36"/>
-              <w:sz w:val="48"/>
-              <w:szCs w:val="48"/>
-            </w:rPr>
-            <w:t>(</w:t>
-          </w:r>
-          <w:r>
-            <w:rPr>
-              <w:rFonts w:ascii="Times New Roman" w:eastAsia="Times New Roman" w:hAnsi="Times New Roman" w:cs="Times New Roman"/>
-              <w:i/>
-              <w:iCs/>
-              <w:color w:val="000000" w:themeColor="text1"/>
-              <w:kern w:val="36"/>
-              <w:sz w:val="48"/>
-              <w:szCs w:val="48"/>
-            </w:rPr>
-            <w:t>Title</w:t>
-          </w:r>
-          <w:r>
-            <w:rPr>
-              <w:rFonts w:ascii="Times New Roman" w:eastAsia="Times New Roman" w:hAnsi="Times New Roman" w:cs="Times New Roman"/>
-              <w:color w:val="000000" w:themeColor="text1"/>
-              <w:kern w:val="36"/>
-              <w:sz w:val="48"/>
-              <w:szCs w:val="48"/>
-            </w:rPr>
-            <w:t>) Preparation template for Journal of Informatics and Web Engineering (JIWE)</w:t>
-          </w:r>
-          <w:r>
-            <w:rPr>
-              <w:rFonts w:ascii="Times New Roman" w:eastAsia="Times New Roman" w:hAnsi="Times New Roman" w:cs="Times New Roman"/>
-              <w:color w:val="000000" w:themeColor="text1"/>
-              <w:kern w:val="36"/>
-              <w:sz w:val="54"/>
-              <w:szCs w:val="54"/>
-            </w:rPr>
-            <w:t xml:space="preserve"> </w:t>
-          </w:r>
-          <w:r>
-            <w:rPr>
-              <w:rFonts w:ascii="Times New Roman" w:eastAsia="Times New Roman" w:hAnsi="Times New Roman" w:cs="Times New Roman"/>
-              <w:color w:val="000000" w:themeColor="text1"/>
-              <w:kern w:val="36"/>
-              <w:sz w:val="54"/>
-              <w:szCs w:val="54"/>
-            </w:rPr>
-            <w:t xml:space="preserve">    </w:t>
-          </w:r>
-          <w:r>
-            <w:rPr>
-              <w:rFonts w:ascii="Times New Roman" w:eastAsia="Times New Roman" w:hAnsi="Times New Roman" w:cs="Times New Roman"/>
-              <w:color w:val="000000" w:themeColor="text1"/>
-              <w:kern w:val="36"/>
-              <w:sz w:val="48"/>
-              <w:szCs w:val="48"/>
-            </w:rPr>
-            <w:t>(</w:t>
-          </w:r>
-          <w:r>
-            <w:rPr>
-              <w:rFonts w:ascii="Times New Roman" w:eastAsia="Times New Roman" w:hAnsi="Times New Roman" w:cs="Times New Roman"/>
-              <w:color w:val="000000" w:themeColor="text1"/>
-              <w:sz w:val="48"/>
-              <w:szCs w:val="48"/>
-            </w:rPr>
-            <w:t>24-Font size, Times New Roman)</w:t>
-          </w:r>
-        </w:p>
-      </w:sdtContent>
-    </w:sdt>
+    <w:p>
+      <w:pPr>
+        <w:spacing w:after="0" w:line="240" w:lineRule="auto"/>
+        <w:ind w:left="46"/>
+        <w:jc w:val="center"/>
+        <w:rPr>
+          <w:rFonts w:ascii="Palatino Linotype" w:eastAsia="Palatino Linotype" w:hAnsi="Palatino Linotype" w:cs="Palatino Linotype"/>
+          <w:color w:val="000000" w:themeColor="text1"/>
+          <w:lang w:eastAsia="en-MY"/>
+        </w:rPr>
+      </w:pPr>
+      <w:r>
+        <w:rPr>
+          <w:rFonts w:ascii="Palatino Linotype" w:eastAsia="Palatino Linotype" w:hAnsi="Palatino Linotype" w:cs="Palatino Linotype"/>
+          <w:b/>
+          <w:color w:val="000000" w:themeColor="text1"/>
+          <w:sz w:val="48"/>
+          <w:szCs w:val="16"/>
+          <w:lang w:eastAsia="en-MY"/>
+        </w:rPr>
+        <w:t>Web Engineering</w:t>
+      </w:r>
+    </w:p>
+    <w:p>
+      <w:pPr>
+        <w:tabs>
+          <w:tab w:val="right" w:pos="9026"/>
+        </w:tabs>
+        <w:spacing w:after="10" w:line="248" w:lineRule="auto"/>
+        <w:jc w:val="center"/>
+        <w:rPr>
+          <w:rFonts w:ascii="Palatino Linotype" w:eastAsia="Palatino Linotype" w:hAnsi="Palatino Linotype" w:cs="Palatino Linotype"/>
+          <w:color w:val="000000" w:themeColor="text1"/>
+          <w:lang w:eastAsia="en-MY"/>
+        </w:rPr>
+      </w:pPr>
+      <w:r>
+        <w:rPr>
+          <w:rFonts w:ascii="Calibri" w:eastAsia="Calibri" w:hAnsi="Calibri" w:cs="Calibri"/>
+          <w:noProof/>
+          <w:color w:val="000000" w:themeColor="text1"/>
+          <w:lang w:eastAsia="en-MY"/>
+        </w:rPr>
+        <mc:AlternateContent>
+          <mc:Choice Requires="wpg">
+            <w:drawing>
+              <wp:anchor distT="0" distB="0" distL="114300" distR="114300" simplePos="0" relativeHeight="251657216" behindDoc="0" locked="0" layoutInCell="1" allowOverlap="1" wp14:anchorId="5AE5092C" wp14:editId="1F9DC7FC">
+                <wp:simplePos x="0" y="0"/>
+                <wp:positionH relativeFrom="margin">
+                  <wp:posOffset>0</wp:posOffset>
+                </wp:positionH>
+                <wp:positionV relativeFrom="paragraph">
+                  <wp:posOffset>162665</wp:posOffset>
+                </wp:positionV>
+                <wp:extent cx="5964072" cy="45719"/>
+                <wp:effectExtent l="0" t="0" r="17780" b="12065"/>
+                <wp:wrapNone/>
+                <wp:docPr id="1418392037" name="Group 1418392037"/>
+                <wp:cNvGraphicFramePr/>
+                <a:graphic xmlns:a="http://schemas.openxmlformats.org/drawingml/2006/main">
+                  <a:graphicData uri="http://schemas.microsoft.com/office/word/2010/wordprocessingGroup">
+                    <wpg:wgp>
+                      <wpg:cNvGrpSpPr/>
+                      <wpg:grpSpPr>
+                        <a:xfrm flipV="1">
+                          <a:off x="0" y="0"/>
+                          <a:ext cx="5964072" cy="45719"/>
+                          <a:chOff x="0" y="0"/>
+                          <a:chExt cx="5731510" cy="20320"/>
+                        </a:xfrm>
+                      </wpg:grpSpPr>
+                      <wps:wsp>
+                        <wps:cNvPr id="925217558" name="Shape 7"/>
+                        <wps:cNvSpPr/>
+                        <wps:spPr>
+                          <a:xfrm>
+                            <a:off x="0" y="0"/>
+                            <a:ext cx="5731510" cy="0"/>
+                          </a:xfrm>
+                          <a:custGeom>
+                            <a:avLst/>
+                            <a:gdLst/>
+                            <a:ahLst/>
+                            <a:cxnLst/>
+                            <a:rect l="0" t="0" r="0" b="0"/>
+                            <a:pathLst>
+                              <a:path w="5731510">
+                                <a:moveTo>
+                                  <a:pt x="0" y="0"/>
+                                </a:moveTo>
+                                <a:lnTo>
+                                  <a:pt x="5731510" y="0"/>
+                                </a:lnTo>
+                              </a:path>
+                            </a:pathLst>
+                          </a:custGeom>
+                          <a:noFill/>
+                          <a:ln w="10160" cap="flat" cmpd="sng" algn="ctr">
+                            <a:solidFill>
+                              <a:srgbClr val="000000"/>
+                            </a:solidFill>
+                            <a:prstDash val="solid"/>
+                            <a:round/>
+                          </a:ln>
+                          <a:effectLst/>
+                        </wps:spPr>
+                        <wps:bodyPr/>
+                      </wps:wsp>
+                      <wps:wsp>
+                        <wps:cNvPr id="75141815" name="Shape 8"/>
+                        <wps:cNvSpPr/>
+                        <wps:spPr>
+                          <a:xfrm>
+                            <a:off x="0" y="20320"/>
+                            <a:ext cx="5731510" cy="0"/>
+                          </a:xfrm>
+                          <a:custGeom>
+                            <a:avLst/>
+                            <a:gdLst/>
+                            <a:ahLst/>
+                            <a:cxnLst/>
+                            <a:rect l="0" t="0" r="0" b="0"/>
+                            <a:pathLst>
+                              <a:path w="5731510">
+                                <a:moveTo>
+                                  <a:pt x="0" y="0"/>
+                                </a:moveTo>
+                                <a:lnTo>
+                                  <a:pt x="5731510" y="0"/>
+                                </a:lnTo>
+                              </a:path>
+                            </a:pathLst>
+                          </a:custGeom>
+                          <a:noFill/>
+                          <a:ln w="10160" cap="flat" cmpd="sng" algn="ctr">
+                            <a:solidFill>
+                              <a:srgbClr val="000000"/>
+                            </a:solidFill>
+                            <a:prstDash val="solid"/>
+                            <a:round/>
+                          </a:ln>
+                          <a:effectLst/>
+                        </wps:spPr>
+                        <wps:bodyPr/>
+                      </wps:wsp>
+                    </wpg:wgp>
+                  </a:graphicData>
+                </a:graphic>
+                <wp14:sizeRelH relativeFrom="margin">
+                  <wp14:pctWidth>0</wp14:pctWidth>
+                </wp14:sizeRelH>
+                <wp14:sizeRelV relativeFrom="margin">
+                  <wp14:pctHeight>0</wp14:pctHeight>
+                </wp14:sizeRelV>
+              </wp:anchor>
+            </w:drawing>
+          </mc:Choice>
+          <mc:Fallback>
+            <w:pict>
+              <v:group w14:anchorId="3E5EAD32" id="Group 1418392037" o:spid="_x0000_s1026" style="position:absolute;margin-left:0;margin-top:12.8pt;width:469.6pt;height:3.6pt;flip:y;z-index:251657216;mso-position-horizontal-relative:margin;mso-width-relative:margin;mso-height-relative:margin" coordsize="57315,203" o:gfxdata="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">
+                <v:shape id="Shape 7" o:spid="_x0000_s1027" style="position:absolute;width:57315;height:0;visibility:visible;mso-wrap-style:square;v-text-anchor:top" coordsize="5731510,0" o:gfxdata="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" path="m,l5731510,e" filled="f" strokeweight=".8pt">
+                  <v:path arrowok="t" textboxrect="0,0,5731510,0"/>
+                </v:shape>
+                <v:shape id="Shape 8" o:spid="_x0000_s1028" style="position:absolute;top:203;width:57315;height:0;visibility:visible;mso-wrap-style:square;v-text-anchor:top" coordsize="5731510,0" o:gfxdata="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" path="m,l5731510,e" filled="f" strokeweight=".8pt">
+                  <v:path arrowok="t" textboxrect="0,0,5731510,0"/>
+                </v:shape>
+                <w10:wrap anchorx="margin"/>
+              </v:group>
+            </w:pict>
+          </mc:Fallback>
+        </mc:AlternateContent>
+      </w:r>
+      <w:r>
+        <w:rPr>
+          <w:rFonts w:ascii="Palatino Linotype" w:eastAsia="Palatino Linotype" w:hAnsi="Palatino Linotype" w:cs="Palatino Linotype"/>
+          <w:color w:val="000000" w:themeColor="text1"/>
+          <w:lang w:eastAsia="en-MY"/>
+        </w:rPr>
+        <w:t xml:space="preserve">Vol. </w:t>
+      </w:r>
+      <w:r>
+        <w:rPr>
+          <w:rFonts w:ascii="Palatino Linotype" w:eastAsia="Palatino Linotype" w:hAnsi="Palatino Linotype" w:cs="Palatino Linotype"/>
+          <w:color w:val="000000" w:themeColor="text1"/>
+          <w:lang w:eastAsia="en-MY"/>
+        </w:rPr>
+        <w:t>3</w:t>
+      </w:r>
+      <w:r>
+        <w:rPr>
+          <w:rFonts w:ascii="Palatino Linotype" w:eastAsia="Palatino Linotype" w:hAnsi="Palatino Linotype" w:cs="Palatino Linotype"/>
+          <w:color w:val="000000" w:themeColor="text1"/>
+          <w:lang w:eastAsia="en-MY"/>
+        </w:rPr>
+        <w:t xml:space="preserve"> No. </w:t>
+      </w:r>
+      <w:r>
+        <w:rPr>
+          <w:rFonts w:ascii="Palatino Linotype" w:eastAsia="Palatino Linotype" w:hAnsi="Palatino Linotype" w:cs="Palatino Linotype"/>
+          <w:color w:val="000000" w:themeColor="text1"/>
+          <w:lang w:eastAsia="en-MY"/>
+        </w:rPr>
+        <w:t>3</w:t>
+      </w:r>
+      <w:r>
+        <w:rPr>
+          <w:rFonts w:ascii="Palatino Linotype" w:eastAsia="Palatino Linotype" w:hAnsi="Palatino Linotype" w:cs="Palatino Linotype"/>
+          <w:color w:val="000000" w:themeColor="text1"/>
+          <w:lang w:eastAsia="en-MY"/>
+        </w:rPr>
+        <w:t xml:space="preserve"> (</w:t>
+      </w:r>
+      <w:r>
+        <w:rPr>
+          <w:rFonts w:ascii="Palatino Linotype" w:eastAsia="Palatino Linotype" w:hAnsi="Palatino Linotype" w:cs="Palatino Linotype"/>
+          <w:color w:val="000000" w:themeColor="text1"/>
+          <w:lang w:eastAsia="en-MY"/>
+        </w:rPr>
+        <w:t>January</w:t>
+      </w:r>
+      <w:r>
+        <w:rPr>
+          <w:rFonts w:ascii="Palatino Linotype" w:eastAsia="Palatino Linotype" w:hAnsi="Palatino Linotype" w:cs="Palatino Linotype"/>
+          <w:color w:val="000000" w:themeColor="text1"/>
+          <w:lang w:eastAsia="en-MY"/>
+        </w:rPr>
+        <w:t xml:space="preserve"> 202</w:t>
+      </w:r>
+      <w:r>
+        <w:rPr>
+          <w:rFonts w:ascii="Palatino Linotype" w:eastAsia="Palatino Linotype" w:hAnsi="Palatino Linotype" w:cs="Palatino Linotype"/>
+          <w:color w:val="000000" w:themeColor="text1"/>
+          <w:lang w:eastAsia="en-MY"/>
+        </w:rPr>
+        <w:t>6</w:t>
+      </w:r>
+      <w:r>
+        <w:rPr>
+          <w:rFonts w:ascii="Palatino Linotype" w:eastAsia="Palatino Linotype" w:hAnsi="Palatino Linotype" w:cs="Palatino Linotype"/>
+          <w:color w:val="000000" w:themeColor="text1"/>
+          <w:lang w:eastAsia="en-MY"/>
+        </w:rPr>
+        <w:t>)</w:t>
+      </w:r>
+      <w:r>
+        <w:rPr>
+          <w:rFonts w:ascii="Palatino Linotype" w:eastAsia="Palatino Linotype" w:hAnsi="Palatino Linotype" w:cs="Palatino Linotype"/>
+          <w:color w:val="000000" w:themeColor="text1"/>
+          <w:lang w:eastAsia="en-MY"/>
+        </w:rPr>
+        <w:tab/>
+      </w:r>
+      <w:proofErr w:type="spellStart"/>
+      <w:r>
+        <w:rPr>
+          <w:rFonts w:ascii="Palatino Linotype" w:eastAsia="Palatino Linotype" w:hAnsi="Palatino Linotype" w:cs="Palatino Linotype"/>
+          <w:color w:val="000000" w:themeColor="text1"/>
+          <w:lang w:eastAsia="en-MY"/>
+        </w:rPr>
+        <w:t>eISSN</w:t>
+      </w:r>
+      <w:proofErr w:type="spellEnd"/>
+      <w:r>
+        <w:rPr>
+          <w:rFonts w:ascii="Palatino Linotype" w:eastAsia="Palatino Linotype" w:hAnsi="Palatino Linotype" w:cs="Palatino Linotype"/>
+          <w:color w:val="000000" w:themeColor="text1"/>
+          <w:lang w:eastAsia="en-MY"/>
+        </w:rPr>
+        <w:t>: 2821-370X</w:t>
+      </w:r>
+    </w:p>
+    <w:p>
+      <w:pPr>
+        <w:shd w:val="clear" w:color="auto" w:fill="FFFFFF"/>
+        <w:spacing w:before="300" w:after="150" w:line="240" w:lineRule="auto"/>
+        <w:jc w:val="center"/>
+        <w:outlineLvl w:val="0"/>
+        <w:rPr>
+          <w:rFonts w:ascii="Times New Roman" w:eastAsia="Times New Roman" w:hAnsi="Times New Roman" w:cs="Times New Roman"/>
+          <w:color w:val="000000" w:themeColor="text1"/>
+          <w:kern w:val="36"/>
+          <w:sz w:val="48"/>
+          <w:szCs w:val="48"/>
+        </w:rPr>
+      </w:pPr>
+      <w:r>
+        <w:rPr>
+          <w:rFonts w:ascii="Times New Roman" w:eastAsia="Times New Roman" w:hAnsi="Times New Roman" w:cs="Times New Roman"/>
+          <w:color w:val="000000" w:themeColor="text1"/>
+          <w:kern w:val="36"/>
+          <w:sz w:val="48"/>
+          <w:szCs w:val="48"/>
+        </w:rPr>
+        <w:t>(</w:t>
+      </w:r>
+      <w:r>
+        <w:rPr>
+          <w:rFonts w:ascii="Times New Roman" w:eastAsia="Times New Roman" w:hAnsi="Times New Roman" w:cs="Times New Roman"/>
+          <w:i/>
+          <w:iCs/>
+          <w:color w:val="000000" w:themeColor="text1"/>
+          <w:kern w:val="36"/>
+          <w:sz w:val="48"/>
+          <w:szCs w:val="48"/>
+        </w:rPr>
+        <w:t>Title</w:t>
+      </w:r>
+      <w:r>
+        <w:rPr>
+          <w:rFonts w:ascii="Times New Roman" w:eastAsia="Times New Roman" w:hAnsi="Times New Roman" w:cs="Times New Roman"/>
+          <w:color w:val="000000" w:themeColor="text1"/>
+          <w:kern w:val="36"/>
+          <w:sz w:val="48"/>
+          <w:szCs w:val="48"/>
+        </w:rPr>
+        <w:t>) Preparation template for Journal of Informatics and Web Engineering (JIWE)</w:t>
+      </w:r>
+      <w:r>
+        <w:rPr>
+          <w:rFonts w:ascii="Times New Roman" w:eastAsia="Times New Roman" w:hAnsi="Times New Roman" w:cs="Times New Roman"/>
+          <w:color w:val="000000" w:themeColor="text1"/>
+          <w:kern w:val="36"/>
+          <w:sz w:val="54"/>
+          <w:szCs w:val="54"/>
+        </w:rPr>
+        <w:t xml:space="preserve"> </w:t>
+      </w:r>
+      <w:r>
+        <w:rPr>
+          <w:rFonts w:ascii="Times New Roman" w:eastAsia="Times New Roman" w:hAnsi="Times New Roman" w:cs="Times New Roman"/>
+          <w:color w:val="000000" w:themeColor="text1"/>
+          <w:kern w:val="36"/>
+          <w:sz w:val="48"/>
+          <w:szCs w:val="48"/>
+        </w:rPr>
+        <w:t>(</w:t>
+      </w:r>
+      <w:r>
+        <w:rPr>
+          <w:rFonts w:ascii="Times New Roman" w:eastAsia="Times New Roman" w:hAnsi="Times New Roman" w:cs="Times New Roman"/>
+          <w:color w:val="000000" w:themeColor="text1"/>
+          <w:sz w:val="48"/>
+          <w:szCs w:val="48"/>
+        </w:rPr>
+        <w:t>24-Font size, Times New Roman)</w:t>
+      </w:r>
+    </w:p>
     <w:p>
       <w:pPr>
         <w:spacing w:after="0"/>
@@ -1108,7 +1014,6 @@
         </w:rPr>
         <w:t xml:space="preserve">tyling, </w:t>
       </w:r>
-      <w:proofErr w:type="gramStart"/>
       <w:r>
         <w:rPr>
           <w:rFonts w:ascii="Times New Roman" w:eastAsia="Times New Roman" w:hAnsi="Times New Roman" w:cs="Times New Roman"/>
@@ -1127,18 +1032,7 @@
           <w:sz w:val="18"/>
           <w:szCs w:val="18"/>
         </w:rPr>
-        <w:t>nsert</w:t>
-      </w:r>
-      <w:proofErr w:type="gramEnd"/>
-      <w:r>
-        <w:rPr>
-          <w:rFonts w:ascii="Times New Roman" w:eastAsia="Times New Roman" w:hAnsi="Times New Roman" w:cs="Times New Roman"/>
-          <w:i/>
-          <w:color w:val="000000" w:themeColor="text1"/>
-          <w:sz w:val="18"/>
-          <w:szCs w:val="18"/>
-        </w:rPr>
-        <w:t xml:space="preserve"> (include </w:t>
+        <w:t xml:space="preserve">nsert (include </w:t>
       </w:r>
       <w:r>
         <w:rPr>
@@ -1252,92 +1146,151 @@
           <w:tcPr>
             <w:tcW w:w="9504" w:type="dxa"/>
           </w:tcPr>
-          <w:sdt>
-            <w:sdtPr>
-              <w:alias w:val="Submission History"/>
-              <w:tag w:val="jiwe:submission-history"/>
-              <w:id w:val="1087121608"/>
-            </w:sdtPr>
-            <w:sdtContent>
-              <w:p>
-                <w:pPr>
-                  <w:spacing w:before="120" w:after="120"/>
-                  <w:jc w:val="right"/>
-                  <w:rPr>
-                    <w:i/>
-                    <w:iCs/>
-                    <w:color w:val="000000" w:themeColor="text1"/>
-                    <w:sz w:val="18"/>
-                    <w:szCs w:val="18"/>
-                  </w:rPr>
-                </w:pPr>
-                <w:r>
-                  <w:rPr>
-                    <w:i/>
-                    <w:iCs/>
-                    <w:color w:val="000000" w:themeColor="text1"/>
-                    <w:kern w:val="36"/>
-                    <w:sz w:val="18"/>
-                    <w:szCs w:val="18"/>
-                  </w:rPr>
-                  <w:t>Received: 14 June 2023; Accepted: 23 December 2023; Published: 16 June 2024</w:t>
-                </w:r>
-              </w:p>
-            </w:sdtContent>
-          </w:sdt>
-          <w:sdt>
-            <w:sdtPr>
-              <w:alias w:val="License Notice"/>
-              <w:tag w:val="jiwe:license-notice"/>
-              <w:id w:val="-870994408"/>
-            </w:sdtPr>
-            <w:sdtContent>
-              <w:p>
-                <w:pPr>
-                  <w:spacing w:before="120" w:after="120"/>
-                  <w:jc w:val="right"/>
-                  <w:rPr>
-                    <w:i/>
-                    <w:iCs/>
-                    <w:color w:val="000000" w:themeColor="text1"/>
-                    <w:sz w:val="18"/>
-                    <w:szCs w:val="18"/>
-                  </w:rPr>
-                </w:pPr>
-                <w:r>
-                  <w:rPr>
-                    <w:i/>
-                    <w:iCs/>
-                    <w:color w:val="000000" w:themeColor="text1"/>
-                    <w:sz w:val="18"/>
-                    <w:szCs w:val="18"/>
-                  </w:rPr>
-                  <w:t xml:space="preserve">This is an open access article under the </w:t>
-                </w:r>
-                <w:hyperlink r:id="rId8" w:history="1">
-                  <w:r>
-                    <w:rPr>
-                      <w:rStyle w:val="Hyperlink"/>
-                      <w:i/>
-                      <w:iCs/>
-                      <w:color w:val="000000" w:themeColor="text1"/>
-                    </w:rPr>
-                    <w:t>CC BY-NC-ND 4.0</w:t>
-                  </w:r>
-                </w:hyperlink>
-                <w:r>
-                  <w:rPr>
-                    <w:i/>
-                    <w:iCs/>
-                    <w:color w:val="000000" w:themeColor="text1"/>
-                    <w:sz w:val="18"/>
-                    <w:szCs w:val="18"/>
-                  </w:rPr>
-                  <w:t xml:space="preserve"> license.</w:t>
-                </w:r>
-              </w:p>
-            </w:sdtContent>
-          </w:sdt>
+          <w:p>
+            <w:pPr>
+              <w:spacing w:before="120" w:after="120"/>
+              <w:jc w:val="right"/>
+              <w:rPr>
+                <w:i/>
+                <w:iCs/>
+                <w:color w:val="000000" w:themeColor="text1"/>
+                <w:sz w:val="18"/>
+                <w:szCs w:val="18"/>
+              </w:rPr>
+            </w:pPr>
+            <w:r>
+              <w:rPr>
+                <w:i/>
+                <w:iCs/>
+                <w:color w:val="000000" w:themeColor="text1"/>
+                <w:kern w:val="36"/>
+                <w:sz w:val="18"/>
+                <w:szCs w:val="18"/>
+              </w:rPr>
+              <w:t>Received: 14 June 202</w:t>
+            </w:r>
+            <w:r>
+              <w:rPr>
+                <w:i/>
+                <w:iCs/>
+                <w:color w:val="000000" w:themeColor="text1"/>
+                <w:kern w:val="36"/>
+                <w:sz w:val="18"/>
+                <w:szCs w:val="18"/>
+              </w:rPr>
+              <w:t>5</w:t>
+            </w:r>
+            <w:r>
+              <w:rPr>
+                <w:i/>
+                <w:iCs/>
+                <w:color w:val="000000" w:themeColor="text1"/>
+                <w:kern w:val="36"/>
+                <w:sz w:val="18"/>
+                <w:szCs w:val="18"/>
+              </w:rPr>
+              <w:t>; Accepted: 23 December 202</w:t>
+            </w:r>
+            <w:r>
+              <w:rPr>
+                <w:i/>
+                <w:iCs/>
+                <w:color w:val="000000" w:themeColor="text1"/>
+                <w:kern w:val="36"/>
+                <w:sz w:val="18"/>
+                <w:szCs w:val="18"/>
+              </w:rPr>
+              <w:t>5</w:t>
+            </w:r>
+            <w:r>
+              <w:rPr>
+                <w:i/>
+                <w:iCs/>
+                <w:color w:val="000000" w:themeColor="text1"/>
+                <w:kern w:val="36"/>
+                <w:sz w:val="18"/>
+                <w:szCs w:val="18"/>
+              </w:rPr>
+              <w:t xml:space="preserve">; Published: 16 </w:t>
+            </w:r>
+            <w:r>
+              <w:rPr>
+                <w:i/>
+                <w:iCs/>
+                <w:color w:val="000000" w:themeColor="text1"/>
+                <w:kern w:val="36"/>
+                <w:sz w:val="18"/>
+                <w:szCs w:val="18"/>
+              </w:rPr>
+              <w:t>January</w:t>
+            </w:r>
+            <w:r>
+              <w:rPr>
+                <w:i/>
+                <w:iCs/>
+                <w:color w:val="000000" w:themeColor="text1"/>
+                <w:kern w:val="36"/>
+                <w:sz w:val="18"/>
+                <w:szCs w:val="18"/>
+              </w:rPr>
+              <w:t xml:space="preserve"> 202</w:t>
+            </w:r>
+            <w:r>
+              <w:rPr>
+                <w:i/>
+                <w:iCs/>
+                <w:color w:val="000000" w:themeColor="text1"/>
+                <w:kern w:val="36"/>
+                <w:sz w:val="18"/>
+                <w:szCs w:val="18"/>
+              </w:rPr>
+              <w:t>6</w:t>
+            </w:r>
+          </w:p>
+          <w:p>
+            <w:pPr>
+              <w:spacing w:before="120" w:after="120"/>
+              <w:jc w:val="right"/>
+              <w:rPr>
+                <w:i/>
+                <w:iCs/>
+                <w:color w:val="000000" w:themeColor="text1"/>
+                <w:sz w:val="18"/>
+                <w:szCs w:val="18"/>
+              </w:rPr>
+            </w:pPr>
+            <w:r>
+              <w:rPr>
+                <w:i/>
+                <w:iCs/>
+                <w:color w:val="000000" w:themeColor="text1"/>
+                <w:sz w:val="18"/>
+                <w:szCs w:val="18"/>
+              </w:rPr>
+              <w:t xml:space="preserve">This is an open access article under the </w:t>
+            </w:r>
+            <w:hyperlink r:id="rId8" w:history="1">
+              <w:r>
+                <w:rPr>
+                  <w:rStyle w:val="Hyperlink"/>
+                  <w:i/>
+                  <w:iCs/>
+                  <w:color w:val="000000" w:themeColor="text1"/>
+                </w:rPr>
+                <w:t>CC BY-NC-ND 4.0</w:t>
+              </w:r>
+            </w:hyperlink>
+            <w:r>
+              <w:rPr>
+                <w:i/>
+                <w:iCs/>
+                <w:color w:val="000000" w:themeColor="text1"/>
+                <w:sz w:val="18"/>
+                <w:szCs w:val="18"/>
+              </w:rPr>
+              <w:t xml:space="preserve"> license.</w:t>
+            </w:r>
+          </w:p>
           <w:p>
             <w:pPr>
               <w:spacing w:before="120" w:after="120"/>
@@ -1430,17 +1383,6 @@
       </w:pPr>
       <w:r>
         <w:rPr>
-          <w:rStyle w:val="Heading1Char"/>
-          <w:rFonts w:eastAsiaTheme="minorEastAsia"/>
-          <w:b w:val="0"/>
-          <w:bCs w:val="0"/>
-          <w:sz w:val="20"/>
-          <w:szCs w:val="20"/>
-        </w:rPr>
-        <w:t>INTRODUCTION</w:t>
-      </w:r>
-      <w:r>
-        <w:rPr>
           <w:rFonts w:ascii="Times New Roman" w:eastAsia="Times New Roman" w:hAnsi="Times New Roman" w:cs="Times New Roman"/>
           <w:b/>
           <w:bCs/>
@@ -1449,7 +1391,7 @@
           <w:sz w:val="20"/>
           <w:szCs w:val="20"/>
         </w:rPr>
-        <w:t xml:space="preserve"> </w:t>
+        <w:t>INTRODUCTION</w:t>
       </w:r>
       <w:r>
         <w:rPr>
@@ -1461,19 +1403,7 @@
           <w:sz w:val="20"/>
           <w:szCs w:val="20"/>
         </w:rPr>
-        <w:t xml:space="preserve">   </w:t>
-      </w:r>
-      <w:r>
-        <w:rPr>
-          <w:rFonts w:ascii="Times New Roman" w:eastAsia="Times New Roman" w:hAnsi="Times New Roman" w:cs="Times New Roman"/>
-          <w:b/>
-          <w:bCs/>
-          <w:color w:val="000000" w:themeColor="text1"/>
-          <w:kern w:val="36"/>
-          <w:sz w:val="20"/>
-          <w:szCs w:val="20"/>
-        </w:rPr>
-        <w:t>(</w:t>
+        <w:t xml:space="preserve"> (</w:t>
       </w:r>
       <w:r>
         <w:rPr>
@@ -1556,14 +1486,13 @@
       </w:pPr>
       <w:r>
         <w:rPr>
-          <w:rStyle w:val="Heading1Char"/>
-          <w:rFonts w:eastAsiaTheme="minorEastAsia"/>
-          <w:b w:val="0"/>
-          <w:bCs w:val="0"/>
-          <w:sz w:val="20"/>
-          <w:szCs w:val="20"/>
-        </w:rPr>
-        <w:lastRenderedPageBreak/>
+          <w:rFonts w:ascii="Times New Roman" w:eastAsia="Times New Roman" w:hAnsi="Times New Roman" w:cs="Times New Roman"/>
+          <w:b/>
+          <w:bCs/>
+          <w:color w:val="000000" w:themeColor="text1"/>
+          <w:sz w:val="20"/>
+          <w:szCs w:val="20"/>
+        </w:rPr>
         <w:t>LITERATURE REVIEW</w:t>
       </w:r>
       <w:r>
@@ -1583,16 +1512,6 @@
           <w:sz w:val="20"/>
           <w:szCs w:val="20"/>
         </w:rPr>
-        <w:t xml:space="preserve">  </w:t>
-      </w:r>
-      <w:r>
-        <w:rPr>
-          <w:rFonts w:ascii="Times New Roman" w:eastAsia="Times New Roman" w:hAnsi="Times New Roman" w:cs="Times New Roman"/>
-          <w:color w:val="000000" w:themeColor="text1"/>
-          <w:kern w:val="36"/>
-          <w:sz w:val="20"/>
-          <w:szCs w:val="20"/>
-        </w:rPr>
         <w:t>(</w:t>
       </w:r>
       <w:r>
@@ -1684,6 +1603,7 @@
           <w:sz w:val="20"/>
           <w:szCs w:val="20"/>
         </w:rPr>
+        <w:lastRenderedPageBreak/>
         <w:t xml:space="preserve">First, confirm that you have the correct template for A4 paper size. Use </w:t>
       </w:r>
       <w:r>
@@ -1842,7 +1762,6 @@
         <w:spacing w:after="150" w:line="240" w:lineRule="auto"/>
         <w:rPr>
           <w:rFonts w:ascii="Times New Roman" w:eastAsia="Times New Roman" w:hAnsi="Times New Roman" w:cs="Times New Roman"/>
-          <w:i/>
           <w:color w:val="000000" w:themeColor="text1"/>
           <w:sz w:val="20"/>
           <w:szCs w:val="20"/>
@@ -1929,23 +1848,14 @@
       </w:pPr>
       <w:r>
         <w:rPr>
-          <w:rStyle w:val="Heading1Char"/>
-          <w:rFonts w:eastAsiaTheme="minorEastAsia"/>
-          <w:b w:val="0"/>
-          <w:bCs w:val="0"/>
+          <w:rFonts w:ascii="Times New Roman" w:eastAsia="Times New Roman" w:hAnsi="Times New Roman" w:cs="Times New Roman"/>
+          <w:b/>
+          <w:bCs/>
+          <w:color w:val="000000" w:themeColor="text1"/>
           <w:sz w:val="20"/>
           <w:szCs w:val="20"/>
         </w:rPr>
         <w:t>RESEARCH METHODOLOGY</w:t>
-      </w:r>
-      <w:r>
-        <w:rPr>
-          <w:rFonts w:ascii="Times New Roman" w:eastAsia="Times New Roman" w:hAnsi="Times New Roman" w:cs="Times New Roman"/>
-          <w:color w:val="000000" w:themeColor="text1"/>
-          <w:sz w:val="20"/>
-          <w:szCs w:val="20"/>
-        </w:rPr>
-        <w:t xml:space="preserve"> </w:t>
       </w:r>
       <w:r>
         <w:rPr>
@@ -2164,6 +2074,7 @@
         </w:rPr>
         <w:t xml:space="preserve">By referencing </w:t>
       </w:r>
+      <w:proofErr w:type="gramStart"/>
       <w:r>
         <w:rPr>
           <w:rFonts w:ascii="Times New Roman" w:eastAsia="Times New Roman" w:hAnsi="Times New Roman" w:cs="Times New Roman"/>
@@ -2180,7 +2091,17 @@
           <w:sz w:val="20"/>
           <w:szCs w:val="20"/>
         </w:rPr>
-        <w:t xml:space="preserve">  and </w:t>
+        <w:t xml:space="preserve">  and</w:t>
+      </w:r>
+      <w:proofErr w:type="gramEnd"/>
+      <w:r>
+        <w:rPr>
+          <w:rFonts w:ascii="Times New Roman" w:eastAsia="Times New Roman" w:hAnsi="Times New Roman" w:cs="Times New Roman"/>
+          <w:color w:val="000000" w:themeColor="text1"/>
+          <w:sz w:val="20"/>
+          <w:szCs w:val="20"/>
+        </w:rPr>
+        <w:t xml:space="preserve"> </w:t>
       </w:r>
       <w:r>
         <w:rPr>
@@ -2225,7 +2146,7 @@
           <w:sz w:val="20"/>
           <w:szCs w:val="20"/>
         </w:rPr>
-        <w:t xml:space="preserve">Place figures and tables nearest to the text that </w:t>
+        <w:t xml:space="preserve">Place figures and tables nearest to the text that references to it. Large figures and tables may span across both columns (only if unavoidable). Figure captions should be below the figures; table captions should appear above the tables. Use “Figure 1” or “Table 1” to refer to the </w:t>
       </w:r>
       <w:proofErr w:type="gramStart"/>
       <w:r>
@@ -2235,7 +2156,7 @@
           <w:sz w:val="20"/>
           <w:szCs w:val="20"/>
         </w:rPr>
-        <w:t>references to</w:t>
+        <w:t>particular Figure</w:t>
       </w:r>
       <w:proofErr w:type="gramEnd"/>
       <w:r>
@@ -2245,7 +2166,7 @@
           <w:sz w:val="20"/>
           <w:szCs w:val="20"/>
         </w:rPr>
-        <w:t xml:space="preserve"> it. Large figures and tables may span across both columns (only if unavoidable). Figure captions should be below the figures; table captions should appear above the tables. Use “Figure 1” or “Table 1” to refer to the </w:t>
+        <w:t xml:space="preserve"> or Table. Use </w:t>
       </w:r>
       <w:proofErr w:type="gramStart"/>
       <w:r>
@@ -2255,7 +2176,16 @@
           <w:sz w:val="20"/>
           <w:szCs w:val="20"/>
         </w:rPr>
-        <w:t>particular Figure</w:t>
+        <w:t>10</w:t>
+      </w:r>
+      <w:r>
+        <w:rPr>
+          <w:rFonts w:ascii="Times New Roman" w:eastAsia="Times New Roman" w:hAnsi="Times New Roman" w:cs="Times New Roman"/>
+          <w:color w:val="000000" w:themeColor="text1"/>
+          <w:sz w:val="20"/>
+          <w:szCs w:val="20"/>
+        </w:rPr>
+        <w:t xml:space="preserve"> point</w:t>
       </w:r>
       <w:proofErr w:type="gramEnd"/>
       <w:r>
@@ -2265,35 +2195,6 @@
           <w:sz w:val="20"/>
           <w:szCs w:val="20"/>
         </w:rPr>
-        <w:t xml:space="preserve"> or Table. Use </w:t>
-      </w:r>
-      <w:proofErr w:type="gramStart"/>
-      <w:r>
-        <w:rPr>
-          <w:rFonts w:ascii="Times New Roman" w:eastAsia="Times New Roman" w:hAnsi="Times New Roman" w:cs="Times New Roman"/>
-          <w:color w:val="000000" w:themeColor="text1"/>
-          <w:sz w:val="20"/>
-          <w:szCs w:val="20"/>
-        </w:rPr>
-        <w:t>10</w:t>
-      </w:r>
-      <w:r>
-        <w:rPr>
-          <w:rFonts w:ascii="Times New Roman" w:eastAsia="Times New Roman" w:hAnsi="Times New Roman" w:cs="Times New Roman"/>
-          <w:color w:val="000000" w:themeColor="text1"/>
-          <w:sz w:val="20"/>
-          <w:szCs w:val="20"/>
-        </w:rPr>
-        <w:t xml:space="preserve"> point</w:t>
-      </w:r>
-      <w:proofErr w:type="gramEnd"/>
-      <w:r>
-        <w:rPr>
-          <w:rFonts w:ascii="Times New Roman" w:eastAsia="Times New Roman" w:hAnsi="Times New Roman" w:cs="Times New Roman"/>
-          <w:color w:val="000000" w:themeColor="text1"/>
-          <w:sz w:val="20"/>
-          <w:szCs w:val="20"/>
-        </w:rPr>
         <w:t xml:space="preserve"> Times New Roman for Figure caption.</w:t>
       </w:r>
       <w:r>
@@ -2306,37 +2207,28 @@
         <w:t xml:space="preserve"> </w:t>
       </w:r>
     </w:p>
-    <w:sdt>
-      <w:sdtPr>
-        <w:alias w:val="Table Caption"/>
-        <w:tag w:val="jiwe:table-caption"/>
-        <w:id w:val="1632371352"/>
-      </w:sdtPr>
-      <w:sdtContent>
-        <w:p>
-          <w:pPr>
-            <w:shd w:val="clear" w:color="auto" w:fill="FFFFFF"/>
-            <w:spacing w:after="150" w:line="240" w:lineRule="auto"/>
-            <w:jc w:val="center"/>
-            <w:rPr>
-              <w:rFonts w:ascii="Times New Roman" w:eastAsia="Times New Roman" w:hAnsi="Times New Roman" w:cs="Times New Roman"/>
-              <w:color w:val="000000" w:themeColor="text1"/>
-              <w:sz w:val="20"/>
-              <w:szCs w:val="20"/>
-            </w:rPr>
-          </w:pPr>
-          <w:r>
-            <w:rPr>
-              <w:rFonts w:ascii="Times New Roman" w:eastAsia="Times New Roman" w:hAnsi="Times New Roman" w:cs="Times New Roman"/>
-              <w:color w:val="000000" w:themeColor="text1"/>
-              <w:sz w:val="20"/>
-              <w:szCs w:val="20"/>
-            </w:rPr>
-            <w:t>Table 1. Table Type Style</w:t>
-          </w:r>
-        </w:p>
-      </w:sdtContent>
-    </w:sdt>
+    <w:p>
+      <w:pPr>
+        <w:shd w:val="clear" w:color="auto" w:fill="FFFFFF"/>
+        <w:spacing w:after="150" w:line="240" w:lineRule="auto"/>
+        <w:jc w:val="center"/>
+        <w:rPr>
+          <w:rFonts w:ascii="Times New Roman" w:eastAsia="Times New Roman" w:hAnsi="Times New Roman" w:cs="Times New Roman"/>
+          <w:color w:val="000000" w:themeColor="text1"/>
+          <w:sz w:val="20"/>
+          <w:szCs w:val="20"/>
+        </w:rPr>
+      </w:pPr>
+      <w:r>
+        <w:rPr>
+          <w:rFonts w:ascii="Times New Roman" w:eastAsia="Times New Roman" w:hAnsi="Times New Roman" w:cs="Times New Roman"/>
+          <w:color w:val="000000" w:themeColor="text1"/>
+          <w:sz w:val="20"/>
+          <w:szCs w:val="20"/>
+        </w:rPr>
+        <w:t>Table 1. Table Type Style</w:t>
+      </w:r>
+    </w:p>
     <w:tbl>
       <w:tblPr>
         <w:tblStyle w:val="TableGrid"/>
@@ -2675,73 +2567,64 @@
         </w:drawing>
       </w:r>
     </w:p>
-    <w:sdt>
-      <w:sdtPr>
-        <w:alias w:val="Figure Caption"/>
-        <w:tag w:val="jiwe:figure-caption"/>
-        <w:id w:val="-773866462"/>
-      </w:sdtPr>
-      <w:sdtContent>
-        <w:p>
-          <w:pPr>
-            <w:shd w:val="clear" w:color="auto" w:fill="FFFFFF"/>
-            <w:spacing w:after="150" w:line="240" w:lineRule="auto"/>
-            <w:jc w:val="center"/>
-            <w:rPr>
-              <w:rFonts w:ascii="Times New Roman" w:eastAsia="Times New Roman" w:hAnsi="Times New Roman" w:cs="Times New Roman"/>
-              <w:color w:val="000000" w:themeColor="text1"/>
-              <w:sz w:val="20"/>
-              <w:szCs w:val="20"/>
-            </w:rPr>
-          </w:pPr>
-          <w:r>
-            <w:rPr>
-              <w:rFonts w:ascii="Times New Roman" w:eastAsia="Times New Roman" w:hAnsi="Times New Roman" w:cs="Times New Roman"/>
-              <w:color w:val="000000" w:themeColor="text1"/>
-              <w:sz w:val="20"/>
-              <w:szCs w:val="20"/>
-            </w:rPr>
-            <w:t xml:space="preserve">Figure 1. Example of a </w:t>
-          </w:r>
-          <w:r>
-            <w:rPr>
-              <w:rFonts w:ascii="Times New Roman" w:eastAsia="Times New Roman" w:hAnsi="Times New Roman" w:cs="Times New Roman"/>
-              <w:color w:val="000000" w:themeColor="text1"/>
-              <w:sz w:val="20"/>
-              <w:szCs w:val="20"/>
-            </w:rPr>
-            <w:t>F</w:t>
-          </w:r>
-          <w:r>
-            <w:rPr>
-              <w:rFonts w:ascii="Times New Roman" w:eastAsia="Times New Roman" w:hAnsi="Times New Roman" w:cs="Times New Roman"/>
-              <w:color w:val="000000" w:themeColor="text1"/>
-              <w:sz w:val="20"/>
-              <w:szCs w:val="20"/>
-            </w:rPr>
-            <w:t xml:space="preserve">igure </w:t>
-          </w:r>
-          <w:r>
-            <w:rPr>
-              <w:rFonts w:ascii="Times New Roman" w:eastAsia="Times New Roman" w:hAnsi="Times New Roman" w:cs="Times New Roman"/>
-              <w:color w:val="000000" w:themeColor="text1"/>
-              <w:sz w:val="20"/>
-              <w:szCs w:val="20"/>
-            </w:rPr>
-            <w:t>C</w:t>
-          </w:r>
-          <w:r>
-            <w:rPr>
-              <w:rFonts w:ascii="Times New Roman" w:eastAsia="Times New Roman" w:hAnsi="Times New Roman" w:cs="Times New Roman"/>
-              <w:color w:val="000000" w:themeColor="text1"/>
-              <w:sz w:val="20"/>
-              <w:szCs w:val="20"/>
-            </w:rPr>
-            <w:t>aption</w:t>
-          </w:r>
-        </w:p>
-      </w:sdtContent>
-    </w:sdt>
+    <w:p>
+      <w:pPr>
+        <w:shd w:val="clear" w:color="auto" w:fill="FFFFFF"/>
+        <w:spacing w:after="150" w:line="240" w:lineRule="auto"/>
+        <w:jc w:val="center"/>
+        <w:rPr>
+          <w:rFonts w:ascii="Times New Roman" w:eastAsia="Times New Roman" w:hAnsi="Times New Roman" w:cs="Times New Roman"/>
+          <w:color w:val="000000" w:themeColor="text1"/>
+          <w:sz w:val="20"/>
+          <w:szCs w:val="20"/>
+        </w:rPr>
+      </w:pPr>
+      <w:r>
+        <w:rPr>
+          <w:rFonts w:ascii="Times New Roman" w:eastAsia="Times New Roman" w:hAnsi="Times New Roman" w:cs="Times New Roman"/>
+          <w:color w:val="000000" w:themeColor="text1"/>
+          <w:sz w:val="20"/>
+          <w:szCs w:val="20"/>
+        </w:rPr>
+        <w:t xml:space="preserve">Figure 1. Example of a </w:t>
+      </w:r>
+      <w:r>
+        <w:rPr>
+          <w:rFonts w:ascii="Times New Roman" w:eastAsia="Times New Roman" w:hAnsi="Times New Roman" w:cs="Times New Roman"/>
+          <w:color w:val="000000" w:themeColor="text1"/>
+          <w:sz w:val="20"/>
+          <w:szCs w:val="20"/>
+        </w:rPr>
+        <w:t>F</w:t>
+      </w:r>
+      <w:r>
+        <w:rPr>
+          <w:rFonts w:ascii="Times New Roman" w:eastAsia="Times New Roman" w:hAnsi="Times New Roman" w:cs="Times New Roman"/>
+          <w:color w:val="000000" w:themeColor="text1"/>
+          <w:sz w:val="20"/>
+          <w:szCs w:val="20"/>
+        </w:rPr>
+        <w:t xml:space="preserve">igure </w:t>
+      </w:r>
+      <w:r>
+        <w:rPr>
+          <w:rFonts w:ascii="Times New Roman" w:eastAsia="Times New Roman" w:hAnsi="Times New Roman" w:cs="Times New Roman"/>
+          <w:color w:val="000000" w:themeColor="text1"/>
+          <w:sz w:val="20"/>
+          <w:szCs w:val="20"/>
+        </w:rPr>
+        <w:t>C</w:t>
+      </w:r>
+      <w:r>
+        <w:rPr>
+          <w:rFonts w:ascii="Times New Roman" w:eastAsia="Times New Roman" w:hAnsi="Times New Roman" w:cs="Times New Roman"/>
+          <w:color w:val="000000" w:themeColor="text1"/>
+          <w:sz w:val="20"/>
+          <w:szCs w:val="20"/>
+        </w:rPr>
+        <w:t>aption</w:t>
+      </w:r>
+    </w:p>
     <w:p>
       <w:pPr>
         <w:shd w:val="clear" w:color="auto" w:fill="FFFFFF"/>
@@ -2812,10 +2695,10 @@
       </w:pPr>
       <w:r>
         <w:rPr>
-          <w:rStyle w:val="Heading1Char"/>
-          <w:rFonts w:eastAsiaTheme="minorEastAsia"/>
-          <w:b w:val="0"/>
-          <w:bCs w:val="0"/>
+          <w:rFonts w:ascii="Times New Roman" w:eastAsia="Times New Roman" w:hAnsi="Times New Roman" w:cs="Times New Roman"/>
+          <w:b/>
+          <w:bCs/>
+          <w:color w:val="000000" w:themeColor="text1"/>
           <w:sz w:val="20"/>
           <w:szCs w:val="20"/>
         </w:rPr>
@@ -2920,10 +2803,10 @@
       </w:pPr>
       <w:r>
         <w:rPr>
-          <w:rStyle w:val="Heading1Char"/>
-          <w:rFonts w:eastAsiaTheme="minorEastAsia"/>
-          <w:b w:val="0"/>
-          <w:bCs w:val="0"/>
+          <w:rFonts w:ascii="Times New Roman" w:eastAsia="Times New Roman" w:hAnsi="Times New Roman" w:cs="Times New Roman"/>
+          <w:b/>
+          <w:bCs/>
+          <w:color w:val="000000" w:themeColor="text1"/>
           <w:sz w:val="20"/>
           <w:szCs w:val="20"/>
         </w:rPr>
@@ -3023,17 +2906,6 @@
       </w:pPr>
       <w:r>
         <w:rPr>
-          <w:rStyle w:val="Heading1Char"/>
-          <w:rFonts w:eastAsiaTheme="minorEastAsia"/>
-          <w:b w:val="0"/>
-          <w:bCs w:val="0"/>
-          <w:sz w:val="20"/>
-          <w:szCs w:val="20"/>
-        </w:rPr>
-        <w:t>ACKNOWLEDGEMENT</w:t>
-      </w:r>
-      <w:r>
-        <w:rPr>
           <w:rFonts w:ascii="Times New Roman" w:eastAsia="Times New Roman" w:hAnsi="Times New Roman" w:cs="Times New Roman"/>
           <w:b/>
           <w:bCs/>
@@ -3041,7 +2913,7 @@
           <w:sz w:val="20"/>
           <w:szCs w:val="20"/>
         </w:rPr>
-        <w:t xml:space="preserve"> </w:t>
+        <w:t xml:space="preserve">ACKNOWLEDGEMENT </w:t>
       </w:r>
       <w:r>
         <w:rPr>
@@ -3091,34 +2963,25 @@
           <w:sz w:val="20"/>
           <w:szCs w:val="20"/>
         </w:rPr>
-        <w:t xml:space="preserve">Put sponsor acknowledgments if any. </w:t>
-      </w:r>
-      <w:r>
-        <w:rPr>
-          <w:rFonts w:ascii="Times New Roman" w:eastAsia="Times New Roman" w:hAnsi="Times New Roman" w:cs="Times New Roman"/>
-          <w:color w:val="000000" w:themeColor="text1"/>
-          <w:sz w:val="20"/>
-          <w:szCs w:val="20"/>
-        </w:rPr>
-        <w:t>Else, may put as ‘</w:t>
-      </w:r>
-      <w:r>
-        <w:rPr>
-          <w:rFonts w:ascii="Times New Roman" w:eastAsia="Times New Roman" w:hAnsi="Times New Roman" w:cs="Times New Roman"/>
-          <w:color w:val="000000" w:themeColor="text1"/>
-          <w:sz w:val="20"/>
-          <w:szCs w:val="20"/>
-        </w:rPr>
-        <w:t>The authors received no funding from any party for the research and publication of this article</w:t>
-      </w:r>
-      <w:r>
-        <w:rPr>
-          <w:rFonts w:ascii="Times New Roman" w:eastAsia="Times New Roman" w:hAnsi="Times New Roman" w:cs="Times New Roman"/>
-          <w:color w:val="000000" w:themeColor="text1"/>
-          <w:sz w:val="20"/>
-          <w:szCs w:val="20"/>
-        </w:rPr>
-        <w:t>’.</w:t>
+        <w:t>Put acknowledgements if any. Else, may put as “</w:t>
+      </w:r>
+      <w:r>
+        <w:rPr>
+          <w:rFonts w:ascii="Times New Roman" w:eastAsia="Times New Roman" w:hAnsi="Times New Roman" w:cs="Times New Roman"/>
+          <w:color w:val="000000" w:themeColor="text1"/>
+          <w:sz w:val="20"/>
+          <w:szCs w:val="20"/>
+        </w:rPr>
+        <w:t>The authors would like to thank the anonymous reviewers for the suggestions to improve the paper</w:t>
+      </w:r>
+      <w:r>
+        <w:rPr>
+          <w:rFonts w:ascii="Times New Roman" w:eastAsia="Times New Roman" w:hAnsi="Times New Roman" w:cs="Times New Roman"/>
+          <w:color w:val="000000" w:themeColor="text1"/>
+          <w:sz w:val="20"/>
+          <w:szCs w:val="20"/>
+        </w:rPr>
+        <w:t>”.</w:t>
       </w:r>
       <w:r>
         <w:rPr>
@@ -3138,149 +3001,21 @@
         </w:rPr>
         <w:t>Use 10-Font size, Times New Roman throughout the entire text.</w:t>
       </w:r>
-      <w:r>
-        <w:rPr>
-          <w:rFonts w:ascii="Times New Roman" w:eastAsia="Times New Roman" w:hAnsi="Times New Roman" w:cs="Times New Roman"/>
-          <w:color w:val="000000" w:themeColor="text1"/>
-          <w:sz w:val="20"/>
-          <w:szCs w:val="20"/>
-        </w:rPr>
-        <w:t xml:space="preserve"> </w:t>
-      </w:r>
-      <w:proofErr w:type="gramStart"/>
-      <w:r>
-        <w:rPr>
-          <w:rFonts w:ascii="Times New Roman" w:eastAsia="Times New Roman" w:hAnsi="Times New Roman" w:cs="Times New Roman"/>
-          <w:color w:val="000000" w:themeColor="text1"/>
-          <w:sz w:val="20"/>
-          <w:szCs w:val="20"/>
-        </w:rPr>
-        <w:t>If</w:t>
-      </w:r>
-      <w:proofErr w:type="gramEnd"/>
-      <w:r>
-        <w:rPr>
-          <w:rFonts w:ascii="Times New Roman" w:eastAsia="Times New Roman" w:hAnsi="Times New Roman" w:cs="Times New Roman"/>
-          <w:color w:val="000000" w:themeColor="text1"/>
-          <w:sz w:val="20"/>
-          <w:szCs w:val="20"/>
-        </w:rPr>
-        <w:t xml:space="preserve"> doesn’t have one in any </w:t>
-      </w:r>
-      <w:proofErr w:type="gramStart"/>
-      <w:r>
-        <w:rPr>
-          <w:rFonts w:ascii="Times New Roman" w:eastAsia="Times New Roman" w:hAnsi="Times New Roman" w:cs="Times New Roman"/>
-          <w:color w:val="000000" w:themeColor="text1"/>
-          <w:sz w:val="20"/>
-          <w:szCs w:val="20"/>
-        </w:rPr>
-        <w:t>manuscript ,</w:t>
-      </w:r>
-      <w:proofErr w:type="gramEnd"/>
-      <w:r>
-        <w:rPr>
-          <w:rFonts w:ascii="Times New Roman" w:eastAsia="Times New Roman" w:hAnsi="Times New Roman" w:cs="Times New Roman"/>
-          <w:color w:val="000000" w:themeColor="text1"/>
-          <w:sz w:val="20"/>
-          <w:szCs w:val="20"/>
-        </w:rPr>
-        <w:t xml:space="preserve"> then it should automatically generate the Acknowledgement with this</w:t>
-      </w:r>
-      <w:r>
-        <w:rPr>
-          <w:rFonts w:ascii="Times New Roman" w:eastAsia="Times New Roman" w:hAnsi="Times New Roman" w:cs="Times New Roman"/>
-          <w:color w:val="000000" w:themeColor="text1"/>
-          <w:sz w:val="20"/>
-          <w:szCs w:val="20"/>
-        </w:rPr>
-        <w:t xml:space="preserve"> (highlighted in yellow</w:t>
-      </w:r>
-      <w:proofErr w:type="gramStart"/>
-      <w:r>
-        <w:rPr>
-          <w:rFonts w:ascii="Times New Roman" w:eastAsia="Times New Roman" w:hAnsi="Times New Roman" w:cs="Times New Roman"/>
-          <w:color w:val="000000" w:themeColor="text1"/>
-          <w:sz w:val="20"/>
-          <w:szCs w:val="20"/>
-        </w:rPr>
-        <w:t>)</w:t>
-      </w:r>
-      <w:r>
-        <w:rPr>
-          <w:rFonts w:ascii="Times New Roman" w:eastAsia="Times New Roman" w:hAnsi="Times New Roman" w:cs="Times New Roman"/>
-          <w:color w:val="000000" w:themeColor="text1"/>
-          <w:sz w:val="20"/>
-          <w:szCs w:val="20"/>
-        </w:rPr>
-        <w:t xml:space="preserve"> :</w:t>
-      </w:r>
-      <w:proofErr w:type="gramEnd"/>
     </w:p>
     <w:p>
       <w:pPr>
         <w:shd w:val="clear" w:color="auto" w:fill="FFFFFF"/>
         <w:spacing w:after="150" w:line="240" w:lineRule="auto"/>
         <w:rPr>
-          <w:rStyle w:val="Heading1Char"/>
-          <w:rFonts w:eastAsiaTheme="minorEastAsia"/>
-          <w:b w:val="0"/>
-          <w:bCs w:val="0"/>
-          <w:sz w:val="20"/>
-          <w:szCs w:val="20"/>
-        </w:rPr>
-      </w:pPr>
-    </w:p>
-    <w:sdt>
-      <w:sdtPr>
-        <w:rPr>
           <w:rFonts w:ascii="Times New Roman" w:eastAsia="Times New Roman" w:hAnsi="Times New Roman" w:cs="Times New Roman"/>
           <w:b/>
           <w:bCs/>
-          <w:kern w:val="36"/>
-          <w:sz w:val="48"/>
-          <w:szCs w:val="48"/>
-        </w:rPr>
-        <w:alias w:val="Acknowledgement"/>
-        <w:tag w:val="jiwe:ack-text"/>
-        <w:id w:val="-1179185278"/>
-      </w:sdtPr>
-      <w:sdtEndPr>
-        <w:rPr>
-          <w:rFonts w:asciiTheme="minorHAnsi" w:eastAsiaTheme="minorEastAsia" w:hAnsiTheme="minorHAnsi" w:cstheme="minorBidi"/>
-          <w:b w:val="0"/>
-          <w:bCs w:val="0"/>
-          <w:kern w:val="0"/>
-          <w:sz w:val="22"/>
-          <w:szCs w:val="22"/>
-        </w:rPr>
-      </w:sdtEndPr>
-      <w:sdtContent>
-        <w:p>
-          <w:pPr>
-            <w:shd w:val="clear" w:color="auto" w:fill="FFFFFF"/>
-            <w:spacing w:after="150" w:line="240" w:lineRule="auto"/>
-            <w:rPr>
-              <w:rFonts w:ascii="Times New Roman" w:eastAsia="Times New Roman" w:hAnsi="Times New Roman" w:cs="Times New Roman"/>
-              <w:color w:val="000000" w:themeColor="text1"/>
-              <w:sz w:val="20"/>
-              <w:szCs w:val="20"/>
-            </w:rPr>
-          </w:pPr>
-          <w:r>
-            <w:rPr>
-              <w:rStyle w:val="Heading1Char"/>
-              <w:rFonts w:eastAsiaTheme="minorEastAsia"/>
-              <w:b w:val="0"/>
-              <w:bCs w:val="0"/>
-              <w:sz w:val="20"/>
-              <w:szCs w:val="20"/>
-            </w:rPr>
-            <w:t>ACKNOWLEDGEMENT</w:t>
-          </w:r>
-        </w:p>
-      </w:sdtContent>
-    </w:sdt>
+          <w:color w:val="000000" w:themeColor="text1"/>
+          <w:sz w:val="20"/>
+          <w:szCs w:val="20"/>
+        </w:rPr>
+      </w:pPr>
+    </w:p>
     <w:p>
       <w:pPr>
         <w:shd w:val="clear" w:color="auto" w:fill="FFFFFF"/>
@@ -3295,11 +3030,53 @@
       <w:r>
         <w:rPr>
           <w:rFonts w:ascii="Times New Roman" w:eastAsia="Times New Roman" w:hAnsi="Times New Roman" w:cs="Times New Roman"/>
-          <w:color w:val="000000" w:themeColor="text1"/>
-          <w:sz w:val="20"/>
-          <w:szCs w:val="20"/>
-        </w:rPr>
-        <w:t>The authors would like to thank the anonymous reviewers who have provided valuable suggestions to improve the article.</w:t>
+          <w:b/>
+          <w:bCs/>
+          <w:color w:val="000000" w:themeColor="text1"/>
+          <w:sz w:val="20"/>
+          <w:szCs w:val="20"/>
+        </w:rPr>
+        <w:t>FUNDING STATEMENT</w:t>
+      </w:r>
+      <w:r>
+        <w:rPr>
+          <w:rFonts w:ascii="Times New Roman" w:eastAsia="Times New Roman" w:hAnsi="Times New Roman" w:cs="Times New Roman"/>
+          <w:b/>
+          <w:bCs/>
+          <w:color w:val="000000" w:themeColor="text1"/>
+          <w:sz w:val="20"/>
+          <w:szCs w:val="20"/>
+        </w:rPr>
+        <w:t xml:space="preserve"> </w:t>
+      </w:r>
+      <w:r>
+        <w:rPr>
+          <w:rFonts w:ascii="Times New Roman" w:eastAsia="Times New Roman" w:hAnsi="Times New Roman" w:cs="Times New Roman"/>
+          <w:color w:val="000000" w:themeColor="text1"/>
+          <w:kern w:val="36"/>
+          <w:sz w:val="20"/>
+          <w:szCs w:val="20"/>
+        </w:rPr>
+        <w:t>(</w:t>
+      </w:r>
+      <w:r>
+        <w:rPr>
+          <w:rFonts w:ascii="Times New Roman" w:eastAsia="Times New Roman" w:hAnsi="Times New Roman" w:cs="Times New Roman"/>
+          <w:color w:val="000000" w:themeColor="text1"/>
+          <w:sz w:val="20"/>
+          <w:szCs w:val="20"/>
+        </w:rPr>
+        <w:t>10-Font size, Times New Roman</w:t>
+      </w:r>
+      <w:r>
+        <w:rPr>
+          <w:rFonts w:ascii="Times New Roman" w:eastAsia="Times New Roman" w:hAnsi="Times New Roman" w:cs="Times New Roman"/>
+          <w:color w:val="000000" w:themeColor="text1"/>
+          <w:kern w:val="36"/>
+          <w:sz w:val="20"/>
+          <w:szCs w:val="20"/>
+        </w:rPr>
+        <w:t>)</w:t>
       </w:r>
     </w:p>
     <w:p>
@@ -3313,6 +3090,33 @@
           <w:szCs w:val="20"/>
         </w:rPr>
       </w:pPr>
+      <w:r>
+        <w:rPr>
+          <w:rFonts w:ascii="Times New Roman" w:eastAsia="Times New Roman" w:hAnsi="Times New Roman" w:cs="Times New Roman"/>
+          <w:color w:val="000000" w:themeColor="text1"/>
+          <w:sz w:val="20"/>
+          <w:szCs w:val="20"/>
+        </w:rPr>
+        <w:t xml:space="preserve">Put </w:t>
+      </w:r>
+      <w:r>
+        <w:rPr>
+          <w:rFonts w:ascii="Times New Roman" w:eastAsia="Times New Roman" w:hAnsi="Times New Roman" w:cs="Times New Roman"/>
+          <w:color w:val="000000" w:themeColor="text1"/>
+          <w:sz w:val="20"/>
+          <w:szCs w:val="20"/>
+        </w:rPr>
+        <w:t xml:space="preserve">funding </w:t>
+      </w:r>
+      <w:r>
+        <w:rPr>
+          <w:rFonts w:ascii="Times New Roman" w:eastAsia="Times New Roman" w:hAnsi="Times New Roman" w:cs="Times New Roman"/>
+          <w:color w:val="000000" w:themeColor="text1"/>
+          <w:sz w:val="20"/>
+          <w:szCs w:val="20"/>
+        </w:rPr>
+        <w:t>sponsor if any. Else, may put as ‘The authors received no funding from any party for the research and publication of this article’. Use 10-Font size, Times New Roman throughout the entire text.</w:t>
+      </w:r>
     </w:p>
     <w:p>
       <w:pPr>
@@ -3321,22 +3125,15 @@
         <w:rPr>
           <w:rFonts w:ascii="Times New Roman" w:eastAsia="Times New Roman" w:hAnsi="Times New Roman" w:cs="Times New Roman"/>
           <w:color w:val="000000" w:themeColor="text1"/>
-          <w:sz w:val="20"/>
-          <w:szCs w:val="20"/>
-        </w:rPr>
-      </w:pPr>
-      <w:r>
-        <w:rPr>
-          <w:rStyle w:val="Heading1Char"/>
-          <w:rFonts w:eastAsiaTheme="minorEastAsia"/>
-          <w:b w:val="0"/>
-          <w:bCs w:val="0"/>
-          <w:sz w:val="20"/>
-          <w:szCs w:val="20"/>
-        </w:rPr>
-        <w:t>FUNDING STATEMENT</w:t>
-      </w:r>
-      <w:r>
+          <w:sz w:val="18"/>
+          <w:szCs w:val="18"/>
+        </w:rPr>
+      </w:pPr>
+    </w:p>
+    <w:p>
+      <w:pPr>
+        <w:shd w:val="clear" w:color="auto" w:fill="FFFFFF"/>
+        <w:spacing w:after="150" w:line="240" w:lineRule="auto"/>
         <w:rPr>
           <w:rFonts w:ascii="Times New Roman" w:eastAsia="Times New Roman" w:hAnsi="Times New Roman" w:cs="Times New Roman"/>
           <w:b/>
@@ -3345,226 +3142,13 @@
           <w:sz w:val="20"/>
           <w:szCs w:val="20"/>
         </w:rPr>
-        <w:t xml:space="preserve"> </w:t>
-      </w:r>
-      <w:r>
-        <w:rPr>
-          <w:rFonts w:ascii="Times New Roman" w:eastAsia="Times New Roman" w:hAnsi="Times New Roman" w:cs="Times New Roman"/>
-          <w:color w:val="000000" w:themeColor="text1"/>
-          <w:kern w:val="36"/>
-          <w:sz w:val="20"/>
-          <w:szCs w:val="20"/>
-        </w:rPr>
-        <w:t>(</w:t>
-      </w:r>
-      <w:r>
-        <w:rPr>
-          <w:rFonts w:ascii="Times New Roman" w:eastAsia="Times New Roman" w:hAnsi="Times New Roman" w:cs="Times New Roman"/>
-          <w:color w:val="000000" w:themeColor="text1"/>
-          <w:sz w:val="20"/>
-          <w:szCs w:val="20"/>
-        </w:rPr>
-        <w:t>10-Font size, Times New Roman</w:t>
-      </w:r>
-      <w:r>
-        <w:rPr>
-          <w:rFonts w:ascii="Times New Roman" w:eastAsia="Times New Roman" w:hAnsi="Times New Roman" w:cs="Times New Roman"/>
-          <w:color w:val="000000" w:themeColor="text1"/>
-          <w:kern w:val="36"/>
-          <w:sz w:val="20"/>
-          <w:szCs w:val="20"/>
-        </w:rPr>
-        <w:t>)</w:t>
-      </w:r>
-    </w:p>
-    <w:p>
-      <w:pPr>
-        <w:shd w:val="clear" w:color="auto" w:fill="FFFFFF"/>
-        <w:spacing w:after="150" w:line="240" w:lineRule="auto"/>
-        <w:rPr>
-          <w:rFonts w:ascii="Times New Roman" w:eastAsia="Times New Roman" w:hAnsi="Times New Roman" w:cs="Times New Roman"/>
-          <w:color w:val="000000" w:themeColor="text1"/>
-          <w:sz w:val="20"/>
-          <w:szCs w:val="20"/>
-        </w:rPr>
-      </w:pPr>
-      <w:r>
-        <w:rPr>
-          <w:rFonts w:ascii="Times New Roman" w:eastAsia="Times New Roman" w:hAnsi="Times New Roman" w:cs="Times New Roman"/>
-          <w:color w:val="000000" w:themeColor="text1"/>
-          <w:sz w:val="20"/>
-          <w:szCs w:val="20"/>
-        </w:rPr>
-        <w:t xml:space="preserve">Put </w:t>
-      </w:r>
-      <w:r>
-        <w:rPr>
-          <w:rFonts w:ascii="Times New Roman" w:eastAsia="Times New Roman" w:hAnsi="Times New Roman" w:cs="Times New Roman"/>
-          <w:color w:val="000000" w:themeColor="text1"/>
-          <w:sz w:val="20"/>
-          <w:szCs w:val="20"/>
-        </w:rPr>
-        <w:t xml:space="preserve">funding statement </w:t>
-      </w:r>
-      <w:r>
-        <w:rPr>
-          <w:rFonts w:ascii="Times New Roman" w:eastAsia="Times New Roman" w:hAnsi="Times New Roman" w:cs="Times New Roman"/>
-          <w:color w:val="000000" w:themeColor="text1"/>
-          <w:sz w:val="20"/>
-          <w:szCs w:val="20"/>
-        </w:rPr>
-        <w:t>if any. Else, may put as ‘The authors received no funding from any party for the research and publication of this article’. Use 10-Font size, Times New Roman throughout the entire text.</w:t>
-      </w:r>
-      <w:r>
-        <w:rPr>
-          <w:rFonts w:ascii="Times New Roman" w:eastAsia="Times New Roman" w:hAnsi="Times New Roman" w:cs="Times New Roman"/>
-          <w:color w:val="000000" w:themeColor="text1"/>
-          <w:sz w:val="20"/>
-          <w:szCs w:val="20"/>
-        </w:rPr>
-        <w:t xml:space="preserve"> </w:t>
-      </w:r>
-      <w:proofErr w:type="gramStart"/>
-      <w:r>
-        <w:rPr>
-          <w:rFonts w:ascii="Times New Roman" w:eastAsia="Times New Roman" w:hAnsi="Times New Roman" w:cs="Times New Roman"/>
-          <w:color w:val="000000" w:themeColor="text1"/>
-          <w:sz w:val="20"/>
-          <w:szCs w:val="20"/>
-        </w:rPr>
-        <w:t>If</w:t>
-      </w:r>
-      <w:proofErr w:type="gramEnd"/>
-      <w:r>
-        <w:rPr>
-          <w:rFonts w:ascii="Times New Roman" w:eastAsia="Times New Roman" w:hAnsi="Times New Roman" w:cs="Times New Roman"/>
-          <w:color w:val="000000" w:themeColor="text1"/>
-          <w:sz w:val="20"/>
-          <w:szCs w:val="20"/>
-        </w:rPr>
-        <w:t xml:space="preserve"> doesn’t have one in </w:t>
-      </w:r>
-      <w:r>
-        <w:rPr>
-          <w:rFonts w:ascii="Times New Roman" w:eastAsia="Times New Roman" w:hAnsi="Times New Roman" w:cs="Times New Roman"/>
-          <w:color w:val="000000" w:themeColor="text1"/>
-          <w:sz w:val="20"/>
-          <w:szCs w:val="20"/>
-        </w:rPr>
-        <w:lastRenderedPageBreak/>
-        <w:t xml:space="preserve">any </w:t>
-      </w:r>
-      <w:proofErr w:type="gramStart"/>
-      <w:r>
-        <w:rPr>
-          <w:rFonts w:ascii="Times New Roman" w:eastAsia="Times New Roman" w:hAnsi="Times New Roman" w:cs="Times New Roman"/>
-          <w:color w:val="000000" w:themeColor="text1"/>
-          <w:sz w:val="20"/>
-          <w:szCs w:val="20"/>
-        </w:rPr>
-        <w:t>manuscript ,</w:t>
-      </w:r>
-      <w:proofErr w:type="gramEnd"/>
-      <w:r>
-        <w:rPr>
-          <w:rFonts w:ascii="Times New Roman" w:eastAsia="Times New Roman" w:hAnsi="Times New Roman" w:cs="Times New Roman"/>
-          <w:color w:val="000000" w:themeColor="text1"/>
-          <w:sz w:val="20"/>
-          <w:szCs w:val="20"/>
-        </w:rPr>
-        <w:t xml:space="preserve"> then it should automatically generate the Acknowledgement with this (highlighted in yellow</w:t>
-      </w:r>
-      <w:proofErr w:type="gramStart"/>
-      <w:r>
-        <w:rPr>
-          <w:rFonts w:ascii="Times New Roman" w:eastAsia="Times New Roman" w:hAnsi="Times New Roman" w:cs="Times New Roman"/>
-          <w:color w:val="000000" w:themeColor="text1"/>
-          <w:sz w:val="20"/>
-          <w:szCs w:val="20"/>
-        </w:rPr>
-        <w:t>) :</w:t>
-      </w:r>
-      <w:proofErr w:type="gramEnd"/>
-      <w:r>
-        <w:rPr>
-          <w:rFonts w:ascii="Times New Roman" w:eastAsia="Times New Roman" w:hAnsi="Times New Roman" w:cs="Times New Roman"/>
-          <w:color w:val="000000" w:themeColor="text1"/>
-          <w:sz w:val="20"/>
-          <w:szCs w:val="20"/>
-        </w:rPr>
-        <w:br/>
-      </w:r>
-      <w:r>
-        <w:rPr>
-          <w:rFonts w:ascii="Times New Roman" w:eastAsia="Times New Roman" w:hAnsi="Times New Roman" w:cs="Times New Roman"/>
-          <w:color w:val="000000" w:themeColor="text1"/>
-          <w:sz w:val="20"/>
-          <w:szCs w:val="20"/>
-        </w:rPr>
-        <w:br/>
-      </w:r>
-      <w:r>
-        <w:rPr>
-          <w:rFonts w:ascii="Times New Roman" w:eastAsia="Times New Roman" w:hAnsi="Times New Roman" w:cs="Times New Roman"/>
-          <w:color w:val="000000" w:themeColor="text1"/>
-          <w:sz w:val="20"/>
-          <w:szCs w:val="20"/>
-        </w:rPr>
-        <w:t>FUNDING STATEMENT</w:t>
-      </w:r>
-    </w:p>
-    <w:p>
-      <w:pPr>
-        <w:shd w:val="clear" w:color="auto" w:fill="FFFFFF"/>
-        <w:spacing w:after="150" w:line="240" w:lineRule="auto"/>
-        <w:rPr>
-          <w:rFonts w:ascii="Times New Roman" w:eastAsia="Times New Roman" w:hAnsi="Times New Roman" w:cs="Times New Roman"/>
-          <w:color w:val="000000" w:themeColor="text1"/>
-          <w:sz w:val="20"/>
-          <w:szCs w:val="20"/>
-        </w:rPr>
-      </w:pPr>
-      <w:r>
-        <w:rPr>
-          <w:rFonts w:ascii="Times New Roman" w:eastAsia="Times New Roman" w:hAnsi="Times New Roman" w:cs="Times New Roman"/>
-          <w:color w:val="000000" w:themeColor="text1"/>
-          <w:sz w:val="20"/>
-          <w:szCs w:val="20"/>
-        </w:rPr>
-        <w:t>The authors received no funding from any party for the research and publication of this article.</w:t>
-      </w:r>
-    </w:p>
-    <w:p>
-      <w:pPr>
-        <w:shd w:val="clear" w:color="auto" w:fill="FFFFFF"/>
-        <w:spacing w:after="150" w:line="240" w:lineRule="auto"/>
-        <w:rPr>
-          <w:rFonts w:ascii="Times New Roman" w:eastAsia="Times New Roman" w:hAnsi="Times New Roman" w:cs="Times New Roman"/>
-          <w:color w:val="000000" w:themeColor="text1"/>
-          <w:sz w:val="18"/>
-          <w:szCs w:val="18"/>
-        </w:rPr>
-      </w:pPr>
-    </w:p>
-    <w:p>
-      <w:pPr>
-        <w:shd w:val="clear" w:color="auto" w:fill="FFFFFF"/>
-        <w:spacing w:after="150" w:line="240" w:lineRule="auto"/>
+      </w:pPr>
+      <w:r>
         <w:rPr>
           <w:rFonts w:ascii="Times New Roman" w:eastAsia="Times New Roman" w:hAnsi="Times New Roman" w:cs="Times New Roman"/>
           <w:b/>
           <w:bCs/>
           <w:color w:val="000000" w:themeColor="text1"/>
-          <w:sz w:val="20"/>
-          <w:szCs w:val="20"/>
-        </w:rPr>
-      </w:pPr>
-      <w:r>
-        <w:rPr>
-          <w:rStyle w:val="Heading1Char"/>
-          <w:rFonts w:eastAsiaTheme="minorEastAsia"/>
-          <w:b w:val="0"/>
-          <w:bCs w:val="0"/>
           <w:sz w:val="20"/>
           <w:szCs w:val="20"/>
         </w:rPr>
@@ -3726,18 +3310,6 @@
         <w:spacing w:after="150" w:line="240" w:lineRule="auto"/>
         <w:rPr>
           <w:rFonts w:ascii="Times New Roman" w:eastAsia="Times New Roman" w:hAnsi="Times New Roman" w:cs="Times New Roman"/>
-          <w:color w:val="000000" w:themeColor="text1"/>
-          <w:sz w:val="20"/>
-          <w:szCs w:val="20"/>
-        </w:rPr>
-      </w:pPr>
-    </w:p>
-    <w:p>
-      <w:pPr>
-        <w:shd w:val="clear" w:color="auto" w:fill="FFFFFF"/>
-        <w:spacing w:after="150" w:line="240" w:lineRule="auto"/>
-        <w:rPr>
-          <w:rFonts w:ascii="Times New Roman" w:eastAsia="Times New Roman" w:hAnsi="Times New Roman" w:cs="Times New Roman"/>
           <w:b/>
           <w:bCs/>
           <w:color w:val="000000" w:themeColor="text1"/>
@@ -3747,13 +3319,14 @@
       </w:pPr>
       <w:r>
         <w:rPr>
-          <w:rStyle w:val="Heading1Char"/>
-          <w:rFonts w:eastAsiaTheme="minorEastAsia"/>
-          <w:b w:val="0"/>
-          <w:bCs w:val="0"/>
-          <w:sz w:val="20"/>
-          <w:szCs w:val="20"/>
-        </w:rPr>
+          <w:rFonts w:ascii="Times New Roman" w:eastAsia="Times New Roman" w:hAnsi="Times New Roman" w:cs="Times New Roman"/>
+          <w:b/>
+          <w:bCs/>
+          <w:color w:val="000000" w:themeColor="text1"/>
+          <w:sz w:val="20"/>
+          <w:szCs w:val="20"/>
+        </w:rPr>
+        <w:lastRenderedPageBreak/>
         <w:t>CONFLICT OF INTERESTS</w:t>
       </w:r>
       <w:r>
@@ -3856,17 +3429,6 @@
       </w:pPr>
       <w:r>
         <w:rPr>
-          <w:rStyle w:val="Heading1Char"/>
-          <w:rFonts w:eastAsiaTheme="minorEastAsia"/>
-          <w:b w:val="0"/>
-          <w:bCs w:val="0"/>
-          <w:sz w:val="20"/>
-          <w:szCs w:val="20"/>
-        </w:rPr>
-        <w:t>ETHICS STATEMENTS</w:t>
-      </w:r>
-      <w:r>
-        <w:rPr>
           <w:rFonts w:ascii="Times New Roman" w:eastAsia="Times New Roman" w:hAnsi="Times New Roman" w:cs="Times New Roman"/>
           <w:b/>
           <w:bCs/>
@@ -3874,7 +3436,7 @@
           <w:sz w:val="20"/>
           <w:szCs w:val="20"/>
         </w:rPr>
-        <w:t xml:space="preserve"> </w:t>
+        <w:t>ETHICS STATEMENTS</w:t>
       </w:r>
       <w:r>
         <w:rPr>
@@ -3885,7 +3447,7 @@
           <w:sz w:val="20"/>
           <w:szCs w:val="20"/>
         </w:rPr>
-        <w:t>(</w:t>
+        <w:t xml:space="preserve"> (</w:t>
       </w:r>
       <w:r>
         <w:rPr>
@@ -3960,109 +3522,9 @@
           <w:sz w:val="20"/>
           <w:szCs w:val="20"/>
         </w:rPr>
-        <w:t xml:space="preserve">If your work </w:t>
-      </w:r>
-      <w:proofErr w:type="gramStart"/>
-      <w:r>
-        <w:rPr>
-          <w:rFonts w:ascii="Times New Roman" w:eastAsia="Times New Roman" w:hAnsi="Times New Roman" w:cs="Times New Roman"/>
-          <w:color w:val="000000" w:themeColor="text1"/>
-          <w:sz w:val="20"/>
-          <w:szCs w:val="20"/>
-        </w:rPr>
-        <w:t>involved</w:t>
-      </w:r>
-      <w:proofErr w:type="gramEnd"/>
-      <w:r>
-        <w:rPr>
-          <w:rFonts w:ascii="Times New Roman" w:eastAsia="Times New Roman" w:hAnsi="Times New Roman" w:cs="Times New Roman"/>
-          <w:color w:val="000000" w:themeColor="text1"/>
-          <w:sz w:val="20"/>
-          <w:szCs w:val="20"/>
-        </w:rPr>
-        <w:t xml:space="preserve"> human subjects, please include a statement here confirming that the relevant informed consent was obtained from those subjects:</w:t>
+        <w:t>If your work involved human subjects, please include a statement here confirming that the relevant informed consent was obtained from those subjects:</w:t>
       </w:r>
     </w:p>
-    <w:sdt>
-      <w:sdtPr>
-        <w:alias w:val="License Notice"/>
-        <w:tag w:val="jiwe:license-notice"/>
-        <w:id w:val="653957351"/>
-      </w:sdtPr>
-      <w:sdtContent>
-        <w:p>
-          <w:pPr>
-            <w:shd w:val="clear" w:color="auto" w:fill="FFFFFF"/>
-            <w:spacing w:after="150" w:line="240" w:lineRule="auto"/>
-            <w:jc w:val="both"/>
-            <w:rPr>
-              <w:rFonts w:ascii="Times New Roman" w:eastAsia="Times New Roman" w:hAnsi="Times New Roman" w:cs="Times New Roman"/>
-              <w:color w:val="000000" w:themeColor="text1"/>
-              <w:sz w:val="20"/>
-              <w:szCs w:val="20"/>
-            </w:rPr>
-          </w:pPr>
-          <w:r>
-            <w:rPr>
-              <w:rFonts w:ascii="Times New Roman" w:eastAsia="Times New Roman" w:hAnsi="Times New Roman" w:cs="Times New Roman"/>
-              <w:color w:val="000000" w:themeColor="text1"/>
-              <w:sz w:val="20"/>
-              <w:szCs w:val="20"/>
-            </w:rPr>
-            <w:t xml:space="preserve">If your work </w:t>
-          </w:r>
-          <w:proofErr w:type="gramStart"/>
-          <w:r>
-            <w:rPr>
-              <w:rFonts w:ascii="Times New Roman" w:eastAsia="Times New Roman" w:hAnsi="Times New Roman" w:cs="Times New Roman"/>
-              <w:color w:val="000000" w:themeColor="text1"/>
-              <w:sz w:val="20"/>
-              <w:szCs w:val="20"/>
-            </w:rPr>
-            <w:t>involved</w:t>
-          </w:r>
-          <w:proofErr w:type="gramEnd"/>
-          <w:r>
-            <w:rPr>
-              <w:rFonts w:ascii="Times New Roman" w:eastAsia="Times New Roman" w:hAnsi="Times New Roman" w:cs="Times New Roman"/>
-              <w:color w:val="000000" w:themeColor="text1"/>
-              <w:sz w:val="20"/>
-              <w:szCs w:val="20"/>
-            </w:rPr>
-            <w:t xml:space="preserve"> animal experiments, please include a statement here </w:t>
-          </w:r>
-          <w:r>
-            <w:rPr>
-              <w:rFonts w:ascii="Times New Roman" w:eastAsia="Times New Roman" w:hAnsi="Times New Roman" w:cs="Times New Roman"/>
-              <w:color w:val="000000" w:themeColor="text1"/>
-              <w:sz w:val="20"/>
-              <w:szCs w:val="20"/>
-            </w:rPr>
-            <w:t xml:space="preserve">of </w:t>
-          </w:r>
-          <w:proofErr w:type="gramStart"/>
-          <w:r>
-            <w:rPr>
-              <w:rFonts w:ascii="Times New Roman" w:eastAsia="Times New Roman" w:hAnsi="Times New Roman" w:cs="Times New Roman"/>
-              <w:color w:val="000000" w:themeColor="text1"/>
-              <w:sz w:val="20"/>
-              <w:szCs w:val="20"/>
-            </w:rPr>
-            <w:t>the ethics</w:t>
-          </w:r>
-          <w:proofErr w:type="gramEnd"/>
-          <w:r>
-            <w:rPr>
-              <w:rFonts w:ascii="Times New Roman" w:eastAsia="Times New Roman" w:hAnsi="Times New Roman" w:cs="Times New Roman"/>
-              <w:color w:val="000000" w:themeColor="text1"/>
-              <w:sz w:val="20"/>
-              <w:szCs w:val="20"/>
-            </w:rPr>
-            <w:t xml:space="preserve"> permission or animal licenses. If animals were used but ethical approval was not required, a clear statement should be included stating why this approval was unnecessary.</w:t>
-          </w:r>
-        </w:p>
-      </w:sdtContent>
-    </w:sdt>
     <w:p>
       <w:pPr>
         <w:shd w:val="clear" w:color="auto" w:fill="FFFFFF"/>
@@ -4082,38 +3544,444 @@
           <w:sz w:val="20"/>
           <w:szCs w:val="20"/>
         </w:rPr>
-        <w:t>If your work involved data collected from social media platforms, please include a statement here confirming that a) informed consent was obtained from participants or that participant data has been fully anonymized, and b) the platform(s)’ data redistribution policies were complied with.</w:t>
+        <w:t xml:space="preserve">If your work involved animal experiments, please include a statement here </w:t>
+      </w:r>
+      <w:r>
+        <w:rPr>
+          <w:rFonts w:ascii="Times New Roman" w:eastAsia="Times New Roman" w:hAnsi="Times New Roman" w:cs="Times New Roman"/>
+          <w:color w:val="000000" w:themeColor="text1"/>
+          <w:sz w:val="20"/>
+          <w:szCs w:val="20"/>
+        </w:rPr>
+        <w:t>of the ethics permission or animal licenses. If animals were used but ethical approval was not required, a clear statement should be included stating why this approval was unnecessary.</w:t>
       </w:r>
     </w:p>
     <w:p>
       <w:pPr>
         <w:shd w:val="clear" w:color="auto" w:fill="FFFFFF"/>
         <w:spacing w:after="150" w:line="240" w:lineRule="auto"/>
-        <w:rPr>
-          <w:rFonts w:ascii="Times New Roman" w:eastAsia="Times New Roman" w:hAnsi="Times New Roman" w:cs="Times New Roman"/>
-          <w:color w:val="000000" w:themeColor="text1"/>
-          <w:sz w:val="20"/>
-          <w:szCs w:val="20"/>
-        </w:rPr>
-      </w:pPr>
+        <w:jc w:val="both"/>
+        <w:rPr>
+          <w:rFonts w:ascii="Times New Roman" w:eastAsia="Times New Roman" w:hAnsi="Times New Roman" w:cs="Times New Roman"/>
+          <w:color w:val="000000" w:themeColor="text1"/>
+          <w:sz w:val="20"/>
+          <w:szCs w:val="20"/>
+        </w:rPr>
+      </w:pPr>
+      <w:r>
+        <w:rPr>
+          <w:rFonts w:ascii="Times New Roman" w:eastAsia="Times New Roman" w:hAnsi="Times New Roman" w:cs="Times New Roman"/>
+          <w:color w:val="000000" w:themeColor="text1"/>
+          <w:sz w:val="20"/>
+          <w:szCs w:val="20"/>
+        </w:rPr>
+        <w:t xml:space="preserve">If your work involved data collected from social media platforms, please include a statement here confirming </w:t>
+      </w:r>
+      <w:proofErr w:type="gramStart"/>
+      <w:r>
+        <w:rPr>
+          <w:rFonts w:ascii="Times New Roman" w:eastAsia="Times New Roman" w:hAnsi="Times New Roman" w:cs="Times New Roman"/>
+          <w:color w:val="000000" w:themeColor="text1"/>
+          <w:sz w:val="20"/>
+          <w:szCs w:val="20"/>
+        </w:rPr>
+        <w:t>that a)</w:t>
+      </w:r>
+      <w:proofErr w:type="gramEnd"/>
+      <w:r>
+        <w:rPr>
+          <w:rFonts w:ascii="Times New Roman" w:eastAsia="Times New Roman" w:hAnsi="Times New Roman" w:cs="Times New Roman"/>
+          <w:color w:val="000000" w:themeColor="text1"/>
+          <w:sz w:val="20"/>
+          <w:szCs w:val="20"/>
+        </w:rPr>
+        <w:t xml:space="preserve"> informed consent was obtained from participants or that participant data has been fully anonymized, and b) </w:t>
+      </w:r>
+      <w:proofErr w:type="gramStart"/>
+      <w:r>
+        <w:rPr>
+          <w:rFonts w:ascii="Times New Roman" w:eastAsia="Times New Roman" w:hAnsi="Times New Roman" w:cs="Times New Roman"/>
+          <w:color w:val="000000" w:themeColor="text1"/>
+          <w:sz w:val="20"/>
+          <w:szCs w:val="20"/>
+        </w:rPr>
+        <w:t>the platform(s)’</w:t>
+      </w:r>
+      <w:proofErr w:type="gramEnd"/>
+      <w:r>
+        <w:rPr>
+          <w:rFonts w:ascii="Times New Roman" w:eastAsia="Times New Roman" w:hAnsi="Times New Roman" w:cs="Times New Roman"/>
+          <w:color w:val="000000" w:themeColor="text1"/>
+          <w:sz w:val="20"/>
+          <w:szCs w:val="20"/>
+        </w:rPr>
+        <w:t xml:space="preserve"> data redistribution policies were complied with.</w:t>
+      </w:r>
     </w:p>
     <w:p>
       <w:pPr>
         <w:shd w:val="clear" w:color="auto" w:fill="FFFFFF"/>
         <w:spacing w:after="150" w:line="240" w:lineRule="auto"/>
-        <w:rPr>
-          <w:rFonts w:ascii="Times New Roman" w:eastAsia="Times New Roman" w:hAnsi="Times New Roman" w:cs="Times New Roman"/>
-          <w:color w:val="000000" w:themeColor="text1"/>
-          <w:sz w:val="20"/>
-          <w:szCs w:val="20"/>
-        </w:rPr>
-      </w:pPr>
-      <w:r>
-        <w:rPr>
-          <w:rStyle w:val="Heading1Char"/>
-          <w:rFonts w:eastAsiaTheme="minorEastAsia"/>
-          <w:b w:val="0"/>
-          <w:bCs w:val="0"/>
+        <w:jc w:val="both"/>
+        <w:rPr>
+          <w:rFonts w:ascii="Times New Roman" w:eastAsia="Times New Roman" w:hAnsi="Times New Roman" w:cs="Times New Roman"/>
+          <w:color w:val="000000" w:themeColor="text1"/>
+          <w:sz w:val="20"/>
+          <w:szCs w:val="20"/>
+        </w:rPr>
+      </w:pPr>
+    </w:p>
+    <w:p>
+      <w:pPr>
+        <w:shd w:val="clear" w:color="auto" w:fill="FFFFFF"/>
+        <w:spacing w:after="150" w:line="240" w:lineRule="auto"/>
+        <w:jc w:val="both"/>
+        <w:rPr>
+          <w:rFonts w:ascii="Times New Roman" w:eastAsia="Times New Roman" w:hAnsi="Times New Roman" w:cs="Times New Roman"/>
+          <w:color w:val="000000" w:themeColor="text1"/>
+          <w:sz w:val="20"/>
+          <w:szCs w:val="20"/>
+        </w:rPr>
+      </w:pPr>
+      <w:r>
+        <w:rPr>
+          <w:rFonts w:ascii="Times New Roman" w:eastAsia="Times New Roman" w:hAnsi="Times New Roman" w:cs="Times New Roman"/>
+          <w:b/>
+          <w:bCs/>
+          <w:color w:val="000000" w:themeColor="text1"/>
+          <w:sz w:val="20"/>
+          <w:szCs w:val="20"/>
+        </w:rPr>
+        <w:t>DATA AVAILABILITY</w:t>
+      </w:r>
+      <w:r>
+        <w:rPr>
+          <w:rFonts w:ascii="Times New Roman" w:eastAsia="Times New Roman" w:hAnsi="Times New Roman" w:cs="Times New Roman"/>
+          <w:color w:val="000000" w:themeColor="text1"/>
+          <w:sz w:val="20"/>
+          <w:szCs w:val="20"/>
+        </w:rPr>
+        <w:t xml:space="preserve"> </w:t>
+      </w:r>
+      <w:r>
+        <w:rPr>
+          <w:rFonts w:ascii="Times New Roman" w:eastAsia="Times New Roman" w:hAnsi="Times New Roman" w:cs="Times New Roman"/>
+          <w:b/>
+          <w:bCs/>
+          <w:color w:val="000000" w:themeColor="text1"/>
+          <w:sz w:val="20"/>
+          <w:szCs w:val="20"/>
+        </w:rPr>
+        <w:t>(</w:t>
+      </w:r>
+      <w:r>
+        <w:rPr>
+          <w:rFonts w:ascii="Times New Roman" w:eastAsia="Times New Roman" w:hAnsi="Times New Roman" w:cs="Times New Roman"/>
+          <w:color w:val="000000" w:themeColor="text1"/>
+          <w:sz w:val="20"/>
+          <w:szCs w:val="20"/>
+        </w:rPr>
+        <w:t>10-Font size, Times New Roman</w:t>
+      </w:r>
+      <w:r>
+        <w:rPr>
+          <w:rFonts w:ascii="Times New Roman" w:eastAsia="Times New Roman" w:hAnsi="Times New Roman" w:cs="Times New Roman"/>
+          <w:color w:val="000000" w:themeColor="text1"/>
+          <w:kern w:val="36"/>
+          <w:sz w:val="20"/>
+          <w:szCs w:val="20"/>
+        </w:rPr>
+        <w:t>)</w:t>
+      </w:r>
+    </w:p>
+    <w:p>
+      <w:pPr>
+        <w:shd w:val="clear" w:color="auto" w:fill="FFFFFF"/>
+        <w:spacing w:after="150" w:line="240" w:lineRule="auto"/>
+        <w:jc w:val="both"/>
+        <w:rPr>
+          <w:rFonts w:ascii="Times New Roman" w:eastAsia="Times New Roman" w:hAnsi="Times New Roman" w:cs="Times New Roman"/>
+          <w:color w:val="000000" w:themeColor="text1"/>
+          <w:sz w:val="20"/>
+          <w:szCs w:val="20"/>
+        </w:rPr>
+      </w:pPr>
+      <w:r>
+        <w:rPr>
+          <w:rFonts w:ascii="Times New Roman" w:eastAsia="Times New Roman" w:hAnsi="Times New Roman" w:cs="Times New Roman"/>
+          <w:color w:val="000000" w:themeColor="text1"/>
+          <w:sz w:val="20"/>
+          <w:szCs w:val="20"/>
+        </w:rPr>
+        <w:t>Choose at least one, adopted from COPE</w:t>
+      </w:r>
+      <w:r>
+        <w:rPr>
+          <w:rFonts w:ascii="Times New Roman" w:eastAsia="Times New Roman" w:hAnsi="Times New Roman" w:cs="Times New Roman"/>
+          <w:color w:val="000000" w:themeColor="text1"/>
+          <w:sz w:val="20"/>
+          <w:szCs w:val="20"/>
+        </w:rPr>
+        <w:t>:</w:t>
+      </w:r>
+    </w:p>
+    <w:p>
+      <w:pPr>
+        <w:pStyle w:val="ListParagraph"/>
+        <w:numPr>
+          <w:ilvl w:val="0"/>
+          <w:numId w:val="12"/>
+        </w:numPr>
+        <w:shd w:val="clear" w:color="auto" w:fill="FFFFFF"/>
+        <w:spacing w:after="150" w:line="240" w:lineRule="auto"/>
+        <w:rPr>
+          <w:rFonts w:ascii="Times New Roman" w:eastAsia="Times New Roman" w:hAnsi="Times New Roman" w:cs="Times New Roman"/>
+          <w:color w:val="000000" w:themeColor="text1"/>
+          <w:sz w:val="20"/>
+          <w:szCs w:val="20"/>
+        </w:rPr>
+      </w:pPr>
+      <w:r>
+        <w:rPr>
+          <w:rFonts w:ascii="Times New Roman" w:eastAsia="Times New Roman" w:hAnsi="Times New Roman" w:cs="Times New Roman"/>
+          <w:color w:val="000000" w:themeColor="text1"/>
+          <w:sz w:val="20"/>
+          <w:szCs w:val="20"/>
+        </w:rPr>
+        <w:t>The data underlying this study are available in the published article and its online supplementary materials.</w:t>
+      </w:r>
+    </w:p>
+    <w:p>
+      <w:pPr>
+        <w:pStyle w:val="ListParagraph"/>
+        <w:numPr>
+          <w:ilvl w:val="0"/>
+          <w:numId w:val="12"/>
+        </w:numPr>
+        <w:shd w:val="clear" w:color="auto" w:fill="FFFFFF"/>
+        <w:spacing w:after="150" w:line="240" w:lineRule="auto"/>
+        <w:rPr>
+          <w:rFonts w:ascii="Times New Roman" w:eastAsia="Times New Roman" w:hAnsi="Times New Roman" w:cs="Times New Roman"/>
+          <w:color w:val="000000" w:themeColor="text1"/>
+          <w:sz w:val="20"/>
+          <w:szCs w:val="20"/>
+        </w:rPr>
+      </w:pPr>
+      <w:r>
+        <w:rPr>
+          <w:rFonts w:ascii="Times New Roman" w:eastAsia="Times New Roman" w:hAnsi="Times New Roman" w:cs="Times New Roman"/>
+          <w:color w:val="000000" w:themeColor="text1"/>
+          <w:sz w:val="20"/>
+          <w:szCs w:val="20"/>
+        </w:rPr>
+        <w:t>The data that support the findings of this study are openly available in [repository name] at http://doi.org/[doi], reference number [reference number].</w:t>
+      </w:r>
+    </w:p>
+    <w:p>
+      <w:pPr>
+        <w:pStyle w:val="ListParagraph"/>
+        <w:numPr>
+          <w:ilvl w:val="0"/>
+          <w:numId w:val="12"/>
+        </w:numPr>
+        <w:shd w:val="clear" w:color="auto" w:fill="FFFFFF"/>
+        <w:spacing w:after="150" w:line="240" w:lineRule="auto"/>
+        <w:rPr>
+          <w:rFonts w:ascii="Times New Roman" w:eastAsia="Times New Roman" w:hAnsi="Times New Roman" w:cs="Times New Roman"/>
+          <w:color w:val="000000" w:themeColor="text1"/>
+          <w:sz w:val="20"/>
+          <w:szCs w:val="20"/>
+        </w:rPr>
+      </w:pPr>
+      <w:r>
+        <w:rPr>
+          <w:rFonts w:ascii="Times New Roman" w:eastAsia="Times New Roman" w:hAnsi="Times New Roman" w:cs="Times New Roman"/>
+          <w:color w:val="000000" w:themeColor="text1"/>
+          <w:sz w:val="20"/>
+          <w:szCs w:val="20"/>
+        </w:rPr>
+        <w:t>The data that support the findings of this study are openly available in [repository name] at http://doi.org/[doi]. These data were derived from sources in the public domain [source with URL].</w:t>
+      </w:r>
+    </w:p>
+    <w:p>
+      <w:pPr>
+        <w:pStyle w:val="ListParagraph"/>
+        <w:numPr>
+          <w:ilvl w:val="0"/>
+          <w:numId w:val="12"/>
+        </w:numPr>
+        <w:shd w:val="clear" w:color="auto" w:fill="FFFFFF"/>
+        <w:spacing w:after="150" w:line="240" w:lineRule="auto"/>
+        <w:rPr>
+          <w:rFonts w:ascii="Times New Roman" w:eastAsia="Times New Roman" w:hAnsi="Times New Roman" w:cs="Times New Roman"/>
+          <w:color w:val="000000" w:themeColor="text1"/>
+          <w:sz w:val="20"/>
+          <w:szCs w:val="20"/>
+        </w:rPr>
+      </w:pPr>
+      <w:r>
+        <w:rPr>
+          <w:rFonts w:ascii="Times New Roman" w:eastAsia="Times New Roman" w:hAnsi="Times New Roman" w:cs="Times New Roman"/>
+          <w:color w:val="000000" w:themeColor="text1"/>
+          <w:sz w:val="20"/>
+          <w:szCs w:val="20"/>
+        </w:rPr>
+        <w:t xml:space="preserve">The data that support the findings of this study are available on request from the corresponding author. The data, which contain information that could compromise the privacy of research participants, </w:t>
+      </w:r>
+      <w:proofErr w:type="gramStart"/>
+      <w:r>
+        <w:rPr>
+          <w:rFonts w:ascii="Times New Roman" w:eastAsia="Times New Roman" w:hAnsi="Times New Roman" w:cs="Times New Roman"/>
+          <w:color w:val="000000" w:themeColor="text1"/>
+          <w:sz w:val="20"/>
+          <w:szCs w:val="20"/>
+        </w:rPr>
+        <w:t>are</w:t>
+      </w:r>
+      <w:proofErr w:type="gramEnd"/>
+      <w:r>
+        <w:rPr>
+          <w:rFonts w:ascii="Times New Roman" w:eastAsia="Times New Roman" w:hAnsi="Times New Roman" w:cs="Times New Roman"/>
+          <w:color w:val="000000" w:themeColor="text1"/>
+          <w:sz w:val="20"/>
+          <w:szCs w:val="20"/>
+        </w:rPr>
+        <w:t xml:space="preserve"> not publicly available due to certain restrictions.</w:t>
+      </w:r>
+    </w:p>
+    <w:p>
+      <w:pPr>
+        <w:pStyle w:val="ListParagraph"/>
+        <w:numPr>
+          <w:ilvl w:val="0"/>
+          <w:numId w:val="12"/>
+        </w:numPr>
+        <w:shd w:val="clear" w:color="auto" w:fill="FFFFFF"/>
+        <w:spacing w:after="150" w:line="240" w:lineRule="auto"/>
+        <w:rPr>
+          <w:rFonts w:ascii="Times New Roman" w:eastAsia="Times New Roman" w:hAnsi="Times New Roman" w:cs="Times New Roman"/>
+          <w:color w:val="000000" w:themeColor="text1"/>
+          <w:sz w:val="20"/>
+          <w:szCs w:val="20"/>
+        </w:rPr>
+      </w:pPr>
+      <w:r>
+        <w:rPr>
+          <w:rFonts w:ascii="Times New Roman" w:eastAsia="Times New Roman" w:hAnsi="Times New Roman" w:cs="Times New Roman"/>
+          <w:color w:val="000000" w:themeColor="text1"/>
+          <w:sz w:val="20"/>
+          <w:szCs w:val="20"/>
+        </w:rPr>
+        <w:t>The data that support the findings of this study are available from [third party]. Restrictions apply to the availability of these data, which were used under license for this study. Data are available [from the authors / at URL] with the permission of [third party].</w:t>
+      </w:r>
+    </w:p>
+    <w:p>
+      <w:pPr>
+        <w:pStyle w:val="ListParagraph"/>
+        <w:numPr>
+          <w:ilvl w:val="0"/>
+          <w:numId w:val="12"/>
+        </w:numPr>
+        <w:shd w:val="clear" w:color="auto" w:fill="FFFFFF"/>
+        <w:spacing w:after="150" w:line="240" w:lineRule="auto"/>
+        <w:rPr>
+          <w:rFonts w:ascii="Times New Roman" w:eastAsia="Times New Roman" w:hAnsi="Times New Roman" w:cs="Times New Roman"/>
+          <w:color w:val="000000" w:themeColor="text1"/>
+          <w:sz w:val="20"/>
+          <w:szCs w:val="20"/>
+        </w:rPr>
+      </w:pPr>
+      <w:r>
+        <w:rPr>
+          <w:rFonts w:ascii="Times New Roman" w:eastAsia="Times New Roman" w:hAnsi="Times New Roman" w:cs="Times New Roman"/>
+          <w:color w:val="000000" w:themeColor="text1"/>
+          <w:sz w:val="20"/>
+          <w:szCs w:val="20"/>
+        </w:rPr>
+        <w:t>The data that support the findings of this study are available from the corresponding author upon reasonable request.</w:t>
+      </w:r>
+    </w:p>
+    <w:p>
+      <w:pPr>
+        <w:pStyle w:val="ListParagraph"/>
+        <w:numPr>
+          <w:ilvl w:val="0"/>
+          <w:numId w:val="12"/>
+        </w:numPr>
+        <w:shd w:val="clear" w:color="auto" w:fill="FFFFFF"/>
+        <w:spacing w:after="150" w:line="240" w:lineRule="auto"/>
+        <w:rPr>
+          <w:rFonts w:ascii="Times New Roman" w:eastAsia="Times New Roman" w:hAnsi="Times New Roman" w:cs="Times New Roman"/>
+          <w:color w:val="000000" w:themeColor="text1"/>
+          <w:sz w:val="20"/>
+          <w:szCs w:val="20"/>
+        </w:rPr>
+      </w:pPr>
+      <w:r>
+        <w:rPr>
+          <w:rFonts w:ascii="Times New Roman" w:eastAsia="Times New Roman" w:hAnsi="Times New Roman" w:cs="Times New Roman"/>
+          <w:color w:val="000000" w:themeColor="text1"/>
+          <w:sz w:val="20"/>
+          <w:szCs w:val="20"/>
+        </w:rPr>
+        <w:t>Derived data supporting the findings of this study are available from the corresponding author on request.</w:t>
+      </w:r>
+    </w:p>
+    <w:p>
+      <w:pPr>
+        <w:pStyle w:val="ListParagraph"/>
+        <w:numPr>
+          <w:ilvl w:val="0"/>
+          <w:numId w:val="12"/>
+        </w:numPr>
+        <w:shd w:val="clear" w:color="auto" w:fill="FFFFFF"/>
+        <w:spacing w:after="150" w:line="240" w:lineRule="auto"/>
+        <w:rPr>
+          <w:rFonts w:ascii="Times New Roman" w:eastAsia="Times New Roman" w:hAnsi="Times New Roman" w:cs="Times New Roman"/>
+          <w:color w:val="000000" w:themeColor="text1"/>
+          <w:sz w:val="20"/>
+          <w:szCs w:val="20"/>
+        </w:rPr>
+      </w:pPr>
+      <w:r>
+        <w:rPr>
+          <w:rFonts w:ascii="Times New Roman" w:eastAsia="Times New Roman" w:hAnsi="Times New Roman" w:cs="Times New Roman"/>
+          <w:color w:val="000000" w:themeColor="text1"/>
+          <w:sz w:val="20"/>
+          <w:szCs w:val="20"/>
+        </w:rPr>
+        <w:t>Data availability is not applicable to this paper as no new data were created or analyzed in this study.</w:t>
+      </w:r>
+    </w:p>
+    <w:p>
+      <w:pPr>
+        <w:shd w:val="clear" w:color="auto" w:fill="FFFFFF"/>
+        <w:spacing w:after="150" w:line="240" w:lineRule="auto"/>
+        <w:rPr>
+          <w:rFonts w:ascii="Times New Roman" w:eastAsia="Times New Roman" w:hAnsi="Times New Roman" w:cs="Times New Roman"/>
+          <w:color w:val="000000" w:themeColor="text1"/>
+          <w:sz w:val="20"/>
+          <w:szCs w:val="20"/>
+        </w:rPr>
+      </w:pPr>
+    </w:p>
+    <w:p>
+      <w:pPr>
+        <w:shd w:val="clear" w:color="auto" w:fill="FFFFFF"/>
+        <w:spacing w:after="150" w:line="240" w:lineRule="auto"/>
+        <w:rPr>
+          <w:rFonts w:ascii="Times New Roman" w:eastAsia="Times New Roman" w:hAnsi="Times New Roman" w:cs="Times New Roman"/>
+          <w:color w:val="000000" w:themeColor="text1"/>
+          <w:sz w:val="20"/>
+          <w:szCs w:val="20"/>
+        </w:rPr>
+      </w:pPr>
+      <w:r>
+        <w:rPr>
+          <w:rFonts w:ascii="Times New Roman" w:eastAsia="Times New Roman" w:hAnsi="Times New Roman" w:cs="Times New Roman"/>
+          <w:b/>
+          <w:bCs/>
+          <w:color w:val="000000" w:themeColor="text1"/>
           <w:sz w:val="20"/>
           <w:szCs w:val="20"/>
         </w:rPr>
@@ -4234,47 +4102,7 @@
           <w:sz w:val="18"/>
           <w:szCs w:val="18"/>
         </w:rPr>
-        <w:t xml:space="preserve">Please use </w:t>
-      </w:r>
-      <w:proofErr w:type="gramStart"/>
-      <w:r>
-        <w:rPr>
-          <w:rFonts w:ascii="Times New Roman" w:eastAsia="Times New Roman" w:hAnsi="Times New Roman" w:cs="Times New Roman"/>
-          <w:color w:val="FF0000"/>
-          <w:sz w:val="18"/>
-          <w:szCs w:val="18"/>
-        </w:rPr>
-        <w:t>the referencing</w:t>
-      </w:r>
-      <w:proofErr w:type="gramEnd"/>
-      <w:r>
-        <w:rPr>
-          <w:rFonts w:ascii="Times New Roman" w:eastAsia="Times New Roman" w:hAnsi="Times New Roman" w:cs="Times New Roman"/>
-          <w:color w:val="FF0000"/>
-          <w:sz w:val="18"/>
-          <w:szCs w:val="18"/>
-        </w:rPr>
-        <w:t xml:space="preserve"> tools such as Zotero, Mendeley</w:t>
-      </w:r>
-      <w:proofErr w:type="gramStart"/>
-      <w:r>
-        <w:rPr>
-          <w:rFonts w:ascii="Times New Roman" w:eastAsia="Times New Roman" w:hAnsi="Times New Roman" w:cs="Times New Roman"/>
-          <w:color w:val="FF0000"/>
-          <w:sz w:val="18"/>
-          <w:szCs w:val="18"/>
-        </w:rPr>
-        <w:t>, Endnote</w:t>
-      </w:r>
-      <w:proofErr w:type="gramEnd"/>
-      <w:r>
-        <w:rPr>
-          <w:rFonts w:ascii="Times New Roman" w:eastAsia="Times New Roman" w:hAnsi="Times New Roman" w:cs="Times New Roman"/>
-          <w:color w:val="FF0000"/>
-          <w:sz w:val="18"/>
-          <w:szCs w:val="18"/>
-        </w:rPr>
-        <w:t xml:space="preserve"> to prepare this section together with in-text citation</w:t>
+        <w:t>Please use the referencing tools such as Zotero, Mendeley, Endnote to prepare this section together with in-text citation</w:t>
       </w:r>
       <w:r>
         <w:rPr>
@@ -4510,6 +4338,7 @@
               <w:sz w:val="18"/>
               <w:szCs w:val="18"/>
             </w:rPr>
+            <w:lastRenderedPageBreak/>
             <w:t>[3]</w:t>
           </w:r>
           <w:r>
@@ -4587,33 +4416,25 @@
     <w:p>
       <w:pPr>
         <w:rPr>
-          <w:bCs/>
-          <w:lang w:val="en-MY"/>
+          <w:rFonts w:ascii="Times New Roman" w:hAnsi="Times New Roman" w:cs="Times New Roman"/>
+          <w:b/>
+          <w:color w:val="000000" w:themeColor="text1"/>
+          <w:sz w:val="21"/>
+          <w:szCs w:val="21"/>
+          <w:lang w:val="pt-BR"/>
         </w:rPr>
       </w:pPr>
       <w:r>
         <w:rPr>
           <w:rStyle w:val="apple-style-span"/>
           <w:rFonts w:ascii="Times New Roman" w:hAnsi="Times New Roman" w:cs="Times New Roman"/>
-          <w:bCs/>
+          <w:b/>
           <w:color w:val="000000" w:themeColor="text1"/>
           <w:sz w:val="21"/>
           <w:szCs w:val="21"/>
-          <w:lang w:val="en-MY"/>
+          <w:lang w:val="pt-BR"/>
         </w:rPr>
         <w:t xml:space="preserve">BIOGRAPHIES OF AUTHORS </w:t>
-      </w:r>
-      <w:r>
-        <w:rPr>
-          <w:rStyle w:val="apple-style-span"/>
-          <w:rFonts w:ascii="Times New Roman" w:hAnsi="Times New Roman" w:cs="Times New Roman"/>
-          <w:bCs/>
-          <w:color w:val="000000" w:themeColor="text1"/>
-          <w:sz w:val="21"/>
-          <w:szCs w:val="21"/>
-          <w:lang w:val="en-MY"/>
-        </w:rPr>
-        <w:t>(10-Font size, Times New Roman)</w:t>
       </w:r>
     </w:p>
     <w:tbl>
@@ -4630,8 +4451,8 @@
         <w:tblLook w:val="04A0" w:firstRow="1" w:lastRow="0" w:firstColumn="1" w:lastColumn="0" w:noHBand="0" w:noVBand="1"/>
       </w:tblPr>
       <w:tblGrid>
-        <w:gridCol w:w="2343"/>
-        <w:gridCol w:w="7007"/>
+        <w:gridCol w:w="2400"/>
+        <w:gridCol w:w="7176"/>
       </w:tblGrid>
       <w:tr>
         <w:trPr>
@@ -4661,7 +4482,6 @@
                 <w:szCs w:val="18"/>
                 <w:lang w:val="pt-BR"/>
               </w:rPr>
-              <w:lastRenderedPageBreak/>
               <w:drawing>
                 <wp:inline distT="0" distB="0" distL="0" distR="0" wp14:anchorId="05330F7A" wp14:editId="12E56CB3">
                   <wp:extent cx="751114" cy="1046828"/>
@@ -4775,7 +4595,19 @@
                 <w:sz w:val="18"/>
                 <w:szCs w:val="18"/>
               </w:rPr>
-              <w:t>Siti Abu Bakar</w:t>
+              <w:t xml:space="preserve">Siti Abu </w:t>
+            </w:r>
+            <w:proofErr w:type="gramStart"/>
+            <w:r>
+              <w:rPr>
+                <w:rFonts w:ascii="Times New Roman" w:hAnsi="Times New Roman" w:cs="Times New Roman"/>
+                <w:b/>
+                <w:bCs/>
+                <w:color w:val="000000" w:themeColor="text1"/>
+                <w:sz w:val="18"/>
+                <w:szCs w:val="18"/>
+              </w:rPr>
+              <w:t>Bakar</w:t>
             </w:r>
             <w:r>
               <w:rPr>
@@ -4794,7 +4626,17 @@
                 <w:sz w:val="18"/>
                 <w:szCs w:val="18"/>
               </w:rPr>
-              <w:t xml:space="preserve"> is a Lecturer in  Multimedia University. Her research focuses on recommendation </w:t>
+              <w:t xml:space="preserve"> is</w:t>
+            </w:r>
+            <w:proofErr w:type="gramEnd"/>
+            <w:r>
+              <w:rPr>
+                <w:rFonts w:ascii="Times New Roman" w:hAnsi="Times New Roman" w:cs="Times New Roman"/>
+                <w:color w:val="000000" w:themeColor="text1"/>
+                <w:sz w:val="18"/>
+                <w:szCs w:val="18"/>
+              </w:rPr>
+              <w:t xml:space="preserve"> a Lecturer </w:t>
             </w:r>
             <w:proofErr w:type="gramStart"/>
             <w:r>
@@ -4804,7 +4646,7 @@
                 <w:sz w:val="18"/>
                 <w:szCs w:val="18"/>
               </w:rPr>
-              <w:t>system</w:t>
+              <w:t>in  Multimedia</w:t>
             </w:r>
             <w:proofErr w:type="gramEnd"/>
             <w:r>
@@ -4814,7 +4656,7 @@
                 <w:sz w:val="18"/>
                 <w:szCs w:val="18"/>
               </w:rPr>
-              <w:t xml:space="preserve"> and blockchain technology.  </w:t>
+              <w:t xml:space="preserve"> University. Her research focuses on recommendation system and blockchain technology.  </w:t>
             </w:r>
             <w:r>
               <w:rPr>
@@ -4867,7 +4709,7 @@
                 <w:color w:val="000000" w:themeColor="text1"/>
                 <w:sz w:val="18"/>
                 <w:szCs w:val="18"/>
-                <w:lang w:val="en-MY"/>
+                <w:lang w:val="pt-BR"/>
               </w:rPr>
             </w:pPr>
           </w:p>
@@ -4879,7 +4721,7 @@
                 <w:color w:val="000000" w:themeColor="text1"/>
                 <w:sz w:val="18"/>
                 <w:szCs w:val="18"/>
-                <w:lang w:val="en-MY"/>
+                <w:lang w:val="pt-BR"/>
               </w:rPr>
             </w:pPr>
             <w:r>
@@ -4888,7 +4730,7 @@
                 <w:color w:val="000000" w:themeColor="text1"/>
                 <w:sz w:val="18"/>
                 <w:szCs w:val="18"/>
-                <w:lang w:val="en-MY"/>
+                <w:lang w:val="pt-BR"/>
               </w:rPr>
               <w:t>&lt;</w:t>
             </w:r>
@@ -4899,7 +4741,7 @@
                 <w:sz w:val="18"/>
                 <w:szCs w:val="18"/>
                 <w:highlight w:val="yellow"/>
-                <w:lang w:val="en-MY"/>
+                <w:lang w:val="pt-BR"/>
               </w:rPr>
               <w:t>write about 80 words of short biography</w:t>
             </w:r>
@@ -4909,7 +4751,7 @@
                 <w:color w:val="000000" w:themeColor="text1"/>
                 <w:sz w:val="18"/>
                 <w:szCs w:val="18"/>
-                <w:lang w:val="en-MY"/>
+                <w:lang w:val="pt-BR"/>
               </w:rPr>
               <w:t>&gt;</w:t>
             </w:r>
@@ -5214,7 +5056,7 @@
               <w:jc w:val="both"/>
               <w:rPr>
                 <w:color w:val="000000" w:themeColor="text1"/>
-                <w:lang w:val="en-MY"/>
+                <w:lang w:val="pt-BR"/>
               </w:rPr>
             </w:pPr>
           </w:p>
@@ -5283,18 +5125,6 @@
         </w:rPr>
       </w:pPr>
     </w:p>
-    <w:p>
-      <w:pPr>
-        <w:shd w:val="clear" w:color="auto" w:fill="FFFFFF"/>
-        <w:spacing w:after="150" w:line="240" w:lineRule="auto"/>
-        <w:rPr>
-          <w:rFonts w:ascii="Times New Roman" w:eastAsia="Times New Roman" w:hAnsi="Times New Roman" w:cs="Times New Roman"/>
-          <w:color w:val="000000" w:themeColor="text1"/>
-          <w:sz w:val="20"/>
-          <w:szCs w:val="20"/>
-        </w:rPr>
-      </w:pPr>
-    </w:p>
     <w:sectPr>
       <w:headerReference w:type="default" r:id="rId16"/>
       <w:footerReference w:type="default" r:id="rId17"/>
@@ -5392,6 +5222,7 @@
   <w:p>
     <w:pPr>
       <w:spacing w:after="3" w:line="250" w:lineRule="auto"/>
+      <w:ind w:left="2880" w:firstLine="720"/>
       <w:rPr>
         <w:rFonts w:ascii="Palatino Linotype" w:eastAsia="Palatino Linotype" w:hAnsi="Palatino Linotype" w:cs="Palatino Linotype"/>
         <w:sz w:val="18"/>
@@ -5405,13 +5236,13 @@
         <w:lang w:eastAsia="en-MY"/>
       </w:rPr>
       <w:drawing>
-        <wp:anchor distT="0" distB="0" distL="114300" distR="114300" simplePos="0" relativeHeight="251659264" behindDoc="0" locked="0" layoutInCell="1" allowOverlap="0" wp14:anchorId="5050EB3C" wp14:editId="0BF5793A">
+        <wp:anchor distT="0" distB="0" distL="114300" distR="114300" simplePos="0" relativeHeight="251659264" behindDoc="0" locked="0" layoutInCell="1" allowOverlap="0" wp14:anchorId="5050EB3C" wp14:editId="4B5D3836">
           <wp:simplePos x="0" y="0"/>
           <wp:positionH relativeFrom="column">
-            <wp:posOffset>-38056</wp:posOffset>
+            <wp:posOffset>29845</wp:posOffset>
           </wp:positionH>
           <wp:positionV relativeFrom="paragraph">
-            <wp:posOffset>63336</wp:posOffset>
+            <wp:posOffset>72390</wp:posOffset>
           </wp:positionV>
           <wp:extent cx="1920240" cy="567055"/>
           <wp:effectExtent l="0" t="0" r="3810" b="4445"/>
@@ -5466,20 +5297,13 @@
         <w:sz w:val="18"/>
         <w:lang w:eastAsia="en-MY"/>
       </w:rPr>
-      <w:t>nal of Informatics and Web Engineering</w:t>
-    </w:r>
-    <w:r>
-      <w:rPr>
-        <w:rFonts w:ascii="Palatino Linotype" w:eastAsia="Palatino Linotype" w:hAnsi="Palatino Linotype" w:cs="Palatino Linotype"/>
-        <w:sz w:val="18"/>
-        <w:lang w:eastAsia="en-MY"/>
-      </w:rPr>
-      <w:t xml:space="preserve"> </w:t>
+      <w:t xml:space="preserve">nal of Informatics and Web Engineering </w:t>
     </w:r>
   </w:p>
   <w:p>
     <w:pPr>
       <w:spacing w:after="3" w:line="250" w:lineRule="auto"/>
+      <w:ind w:left="2880" w:firstLine="720"/>
       <w:rPr>
         <w:rFonts w:ascii="Palatino Linotype" w:eastAsia="Palatino Linotype" w:hAnsi="Palatino Linotype" w:cs="Palatino Linotype"/>
         <w:sz w:val="18"/>
@@ -5491,24 +5315,19 @@
         <w:rPr>
           <w:rStyle w:val="Hyperlink"/>
           <w:rFonts w:ascii="Palatino Linotype" w:eastAsia="Palatino Linotype" w:hAnsi="Palatino Linotype" w:cs="Palatino Linotype"/>
+          <w:color w:val="auto"/>
           <w:sz w:val="18"/>
+          <w:u w:val="none"/>
           <w:lang w:eastAsia="en-MY"/>
         </w:rPr>
         <w:t>https://doi.org/10.33093/jiwe.2024.x.x.x</w:t>
       </w:r>
     </w:hyperlink>
-    <w:r>
-      <w:rPr>
-        <w:rFonts w:ascii="Palatino Linotype" w:eastAsia="Palatino Linotype" w:hAnsi="Palatino Linotype" w:cs="Palatino Linotype"/>
-        <w:sz w:val="18"/>
-        <w:lang w:eastAsia="en-MY"/>
-      </w:rPr>
-      <w:t xml:space="preserve"> </w:t>
-    </w:r>
   </w:p>
   <w:p>
     <w:pPr>
       <w:spacing w:after="3" w:line="250" w:lineRule="auto"/>
+      <w:ind w:left="2880" w:firstLine="720"/>
       <w:rPr>
         <w:rFonts w:ascii="Palatino Linotype" w:eastAsia="Palatino Linotype" w:hAnsi="Palatino Linotype" w:cs="Palatino Linotype"/>
         <w:sz w:val="18"/>
@@ -5557,15 +5376,7 @@
         <w:sz w:val="18"/>
         <w:lang w:eastAsia="en-MY"/>
       </w:rPr>
-      <w:t xml:space="preserve"> Bhd.</w:t>
-    </w:r>
-    <w:r>
-      <w:rPr>
-        <w:rFonts w:ascii="Palatino Linotype" w:eastAsia="Palatino Linotype" w:hAnsi="Palatino Linotype" w:cs="Palatino Linotype"/>
-        <w:sz w:val="18"/>
-        <w:lang w:eastAsia="en-MY"/>
-      </w:rPr>
-      <w:t xml:space="preserve"> </w:t>
+      <w:t xml:space="preserve"> Bhd. </w:t>
     </w:r>
   </w:p>
   <w:p>
@@ -5574,7 +5385,6 @@
       <w:ind w:left="2880"/>
       <w:rPr>
         <w:rFonts w:ascii="Palatino Linotype" w:eastAsia="Palatino Linotype" w:hAnsi="Palatino Linotype" w:cs="Palatino Linotype"/>
-        <w:sz w:val="18"/>
         <w:lang w:eastAsia="en-MY"/>
       </w:rPr>
     </w:pPr>
@@ -5584,7 +5394,7 @@
         <w:sz w:val="18"/>
         <w:lang w:eastAsia="en-MY"/>
       </w:rPr>
-      <w:t>Published by MMU Press.</w:t>
+      <w:t xml:space="preserve">        </w:t>
     </w:r>
     <w:r>
       <w:rPr>
@@ -5592,98 +5402,67 @@
         <w:sz w:val="18"/>
         <w:lang w:eastAsia="en-MY"/>
       </w:rPr>
-      <w:t xml:space="preserve"> </w:t>
+      <w:tab/>
     </w:r>
-  </w:p>
-  <w:p>
-    <w:pPr>
-      <w:spacing w:after="3" w:line="250" w:lineRule="auto"/>
-      <w:ind w:left="2880"/>
-      <w:rPr>
-        <w:rFonts w:ascii="Palatino Linotype" w:eastAsia="Palatino Linotype" w:hAnsi="Palatino Linotype" w:cs="Palatino Linotype"/>
-        <w:lang w:eastAsia="en-MY"/>
-      </w:rPr>
-    </w:pPr>
     <w:r>
       <w:rPr>
         <w:rFonts w:ascii="Palatino Linotype" w:eastAsia="Palatino Linotype" w:hAnsi="Palatino Linotype" w:cs="Palatino Linotype"/>
         <w:sz w:val="18"/>
         <w:lang w:eastAsia="en-MY"/>
       </w:rPr>
-      <w:t xml:space="preserve">      </w:t>
+      <w:t xml:space="preserve">Published by MMU Press. URL: </w:t>
     </w:r>
+    <w:hyperlink r:id="rId3">
+      <w:r>
+        <w:rPr>
+          <w:rFonts w:ascii="Palatino Linotype" w:eastAsia="Palatino Linotype" w:hAnsi="Palatino Linotype" w:cs="Palatino Linotype"/>
+          <w:sz w:val="18"/>
+          <w:lang w:eastAsia="en-MY"/>
+        </w:rPr>
+        <w:t>https://</w:t>
+      </w:r>
+    </w:hyperlink>
+    <w:hyperlink r:id="rId4">
+      <w:r>
+        <w:rPr>
+          <w:rFonts w:ascii="Palatino Linotype" w:eastAsia="Palatino Linotype" w:hAnsi="Palatino Linotype" w:cs="Palatino Linotype"/>
+          <w:sz w:val="18"/>
+          <w:lang w:eastAsia="en-MY"/>
+        </w:rPr>
+        <w:t>journals</w:t>
+      </w:r>
+    </w:hyperlink>
+    <w:hyperlink r:id="rId5">
+      <w:r>
+        <w:rPr>
+          <w:rFonts w:ascii="Palatino Linotype" w:eastAsia="Palatino Linotype" w:hAnsi="Palatino Linotype" w:cs="Palatino Linotype"/>
+          <w:sz w:val="18"/>
+          <w:lang w:eastAsia="en-MY"/>
+        </w:rPr>
+        <w:t>.mmupress.com/</w:t>
+      </w:r>
+    </w:hyperlink>
     <w:r>
       <w:rPr>
         <w:rFonts w:ascii="Palatino Linotype" w:eastAsia="Palatino Linotype" w:hAnsi="Palatino Linotype" w:cs="Palatino Linotype"/>
         <w:sz w:val="18"/>
         <w:lang w:eastAsia="en-MY"/>
       </w:rPr>
-      <w:t xml:space="preserve">URL: </w:t>
+      <w:t>jiw</w:t>
     </w:r>
-    <w:hyperlink r:id="rId3">
-      <w:r>
-        <w:rPr>
-          <w:rFonts w:ascii="Palatino Linotype" w:eastAsia="Palatino Linotype" w:hAnsi="Palatino Linotype" w:cs="Palatino Linotype"/>
-          <w:sz w:val="18"/>
-          <w:lang w:eastAsia="en-MY"/>
-        </w:rPr>
-        <w:t>https://</w:t>
-      </w:r>
-    </w:hyperlink>
-    <w:hyperlink r:id="rId4">
-      <w:r>
-        <w:rPr>
-          <w:rFonts w:ascii="Palatino Linotype" w:eastAsia="Palatino Linotype" w:hAnsi="Palatino Linotype" w:cs="Palatino Linotype"/>
-          <w:sz w:val="18"/>
-          <w:lang w:eastAsia="en-MY"/>
-        </w:rPr>
-        <w:t>journals</w:t>
-      </w:r>
-    </w:hyperlink>
-    <w:hyperlink r:id="rId5">
-      <w:r>
-        <w:rPr>
-          <w:rFonts w:ascii="Palatino Linotype" w:eastAsia="Palatino Linotype" w:hAnsi="Palatino Linotype" w:cs="Palatino Linotype"/>
-          <w:sz w:val="18"/>
-          <w:lang w:eastAsia="en-MY"/>
-        </w:rPr>
-        <w:t>.mmupress.com/</w:t>
-      </w:r>
-    </w:hyperlink>
     <w:r>
       <w:rPr>
         <w:rFonts w:ascii="Palatino Linotype" w:eastAsia="Palatino Linotype" w:hAnsi="Palatino Linotype" w:cs="Palatino Linotype"/>
         <w:sz w:val="18"/>
         <w:lang w:eastAsia="en-MY"/>
       </w:rPr>
-      <w:t>jiw</w:t>
-    </w:r>
-    <w:r>
-      <w:rPr>
-        <w:rFonts w:ascii="Palatino Linotype" w:eastAsia="Palatino Linotype" w:hAnsi="Palatino Linotype" w:cs="Palatino Linotype"/>
-        <w:sz w:val="18"/>
-        <w:lang w:eastAsia="en-MY"/>
-      </w:rPr>
       <w:t>e</w:t>
-    </w:r>
-    <w:r>
-      <w:rPr>
-        <w:rFonts w:ascii="Palatino Linotype" w:eastAsia="Palatino Linotype" w:hAnsi="Palatino Linotype" w:cs="Palatino Linotype"/>
-        <w:sz w:val="18"/>
-        <w:lang w:eastAsia="en-MY"/>
-      </w:rPr>
-      <w:t xml:space="preserve">    </w:t>
     </w:r>
   </w:p>
   <w:p>
     <w:pPr>
       <w:pStyle w:val="Footer"/>
       <w:jc w:val="center"/>
-    </w:pPr>
-  </w:p>
-  <w:p>
-    <w:pPr>
-      <w:pStyle w:val="Footer"/>
     </w:pPr>
   </w:p>
 </w:ftr>
@@ -5827,7 +5606,7 @@
         </mc:Choice>
         <mc:Fallback>
           <w:pict>
-            <v:group w14:anchorId="23E2BB5E" id="Group 15910" o:spid="_x0000_s1026" style="position:absolute;margin-left:0;margin-top:55pt;width:468.25pt;height:4.5pt;z-index:251663872;mso-position-horizontal:left;mso-position-horizontal-relative:margin;mso-position-vertical-relative:page;mso-width-relative:margin;mso-height-relative:margin" coordsize="57308,101" o:gfxdata="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">
+            <v:group w14:anchorId="3C41C307" id="Group 15910" o:spid="_x0000_s1026" style="position:absolute;margin-left:0;margin-top:55pt;width:468.25pt;height:4.5pt;z-index:251663872;mso-position-horizontal:left;mso-position-horizontal-relative:margin;mso-position-vertical-relative:page;mso-width-relative:margin;mso-height-relative:margin" coordsize="57308,101" o:gfxdata="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">
               <v:shape id="Shape 15911" o:spid="_x0000_s1027" style="position:absolute;width:57308;height:0;visibility:visible;mso-wrap-style:square;v-text-anchor:top" coordsize="5730875,0" o:gfxdata="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" path="m5730875,l,e" filled="f" strokeweight=".8pt">
                 <v:path arrowok="t" textboxrect="0,0,5730875,0"/>
               </v:shape>
@@ -6048,6 +5827,119 @@
     </w:lvl>
   </w:abstractNum>
   <w:abstractNum w:abstractNumId="1" w15:restartNumberingAfterBreak="0">
+    <w:nsid w:val="05234811"/>
+    <w:multiLevelType w:val="hybridMultilevel"/>
+    <w:tmpl w:val="FAE269F8"/>
+    <w:lvl w:ilvl="0" w:tplc="44090001">
+      <w:start w:val="1"/>
+      <w:numFmt w:val="bullet"/>
+      <w:lvlText w:val=""/>
+      <w:lvlJc w:val="left"/>
+      <w:pPr>
+        <w:ind w:left="720" w:hanging="360"/>
+      </w:pPr>
+      <w:rPr>
+        <w:rFonts w:ascii="Symbol" w:hAnsi="Symbol" w:hint="default"/>
+      </w:rPr>
+    </w:lvl>
+    <w:lvl w:ilvl="1" w:tplc="44090003" w:tentative="1">
+      <w:start w:val="1"/>
+      <w:numFmt w:val="bullet"/>
+      <w:lvlText w:val="o"/>
+      <w:lvlJc w:val="left"/>
+      <w:pPr>
+        <w:ind w:left="1440" w:hanging="360"/>
+      </w:pPr>
+      <w:rPr>
+        <w:rFonts w:ascii="Courier New" w:hAnsi="Courier New" w:cs="Courier New" w:hint="default"/>
+      </w:rPr>
+    </w:lvl>
+    <w:lvl w:ilvl="2" w:tplc="44090005" w:tentative="1">
+      <w:start w:val="1"/>
+      <w:numFmt w:val="bullet"/>
+      <w:lvlText w:val=""/>
+      <w:lvlJc w:val="left"/>
+      <w:pPr>
+        <w:ind w:left="2160" w:hanging="360"/>
+      </w:pPr>
+      <w:rPr>
+        <w:rFonts w:ascii="Wingdings" w:hAnsi="Wingdings" w:hint="default"/>
+      </w:rPr>
+    </w:lvl>
+    <w:lvl w:ilvl="3" w:tplc="44090001" w:tentative="1">
+      <w:start w:val="1"/>
+      <w:numFmt w:val="bullet"/>
+      <w:lvlText w:val=""/>
+      <w:lvlJc w:val="left"/>
+      <w:pPr>
+        <w:ind w:left="2880" w:hanging="360"/>
+      </w:pPr>
+      <w:rPr>
+        <w:rFonts w:ascii="Symbol" w:hAnsi="Symbol" w:hint="default"/>
+      </w:rPr>
+    </w:lvl>
+    <w:lvl w:ilvl="4" w:tplc="44090003" w:tentative="1">
+      <w:start w:val="1"/>
+      <w:numFmt w:val="bullet"/>
+      <w:lvlText w:val="o"/>
+      <w:lvlJc w:val="left"/>
+      <w:pPr>
+        <w:ind w:left="3600" w:hanging="360"/>
+      </w:pPr>
+      <w:rPr>
+        <w:rFonts w:ascii="Courier New" w:hAnsi="Courier New" w:cs="Courier New" w:hint="default"/>
+      </w:rPr>
+    </w:lvl>
+    <w:lvl w:ilvl="5" w:tplc="44090005" w:tentative="1">
+      <w:start w:val="1"/>
+      <w:numFmt w:val="bullet"/>
+      <w:lvlText w:val=""/>
+      <w:lvlJc w:val="left"/>
+      <w:pPr>
+        <w:ind w:left="4320" w:hanging="360"/>
+      </w:pPr>
+      <w:rPr>
+        <w:rFonts w:ascii="Wingdings" w:hAnsi="Wingdings" w:hint="default"/>
+      </w:rPr>
+    </w:lvl>
+    <w:lvl w:ilvl="6" w:tplc="44090001" w:tentative="1">
+      <w:start w:val="1"/>
+      <w:numFmt w:val="bullet"/>
+      <w:lvlText w:val=""/>
+      <w:lvlJc w:val="left"/>
+      <w:pPr>
+        <w:ind w:left="5040" w:hanging="360"/>
+      </w:pPr>
+      <w:rPr>
+        <w:rFonts w:ascii="Symbol" w:hAnsi="Symbol" w:hint="default"/>
+      </w:rPr>
+    </w:lvl>
+    <w:lvl w:ilvl="7" w:tplc="44090003" w:tentative="1">
+      <w:start w:val="1"/>
+      <w:numFmt w:val="bullet"/>
+      <w:lvlText w:val="o"/>
+      <w:lvlJc w:val="left"/>
+      <w:pPr>
+        <w:ind w:left="5760" w:hanging="360"/>
+      </w:pPr>
+      <w:rPr>
+        <w:rFonts w:ascii="Courier New" w:hAnsi="Courier New" w:cs="Courier New" w:hint="default"/>
+      </w:rPr>
+    </w:lvl>
+    <w:lvl w:ilvl="8" w:tplc="44090005" w:tentative="1">
+      <w:start w:val="1"/>
+      <w:numFmt w:val="bullet"/>
+      <w:lvlText w:val=""/>
+      <w:lvlJc w:val="left"/>
+      <w:pPr>
+        <w:ind w:left="6480" w:hanging="360"/>
+      </w:pPr>
+      <w:rPr>
+        <w:rFonts w:ascii="Wingdings" w:hAnsi="Wingdings" w:hint="default"/>
+      </w:rPr>
+    </w:lvl>
+  </w:abstractNum>
+  <w:abstractNum w:abstractNumId="2" w15:restartNumberingAfterBreak="0">
     <w:nsid w:val="08A147DB"/>
     <w:multiLevelType w:val="hybridMultilevel"/>
     <w:tmpl w:val="B8FC3B20"/>
@@ -6160,7 +6052,7 @@
       </w:rPr>
     </w:lvl>
   </w:abstractNum>
-  <w:abstractNum w:abstractNumId="2" w15:restartNumberingAfterBreak="0">
+  <w:abstractNum w:abstractNumId="3" w15:restartNumberingAfterBreak="0">
     <w:nsid w:val="0F4924EC"/>
     <w:multiLevelType w:val="hybridMultilevel"/>
     <w:tmpl w:val="6450B5EA"/>
@@ -6252,7 +6144,7 @@
       </w:pPr>
     </w:lvl>
   </w:abstractNum>
-  <w:abstractNum w:abstractNumId="3" w15:restartNumberingAfterBreak="0">
+  <w:abstractNum w:abstractNumId="4" w15:restartNumberingAfterBreak="0">
     <w:nsid w:val="1F1652AD"/>
     <w:multiLevelType w:val="multilevel"/>
     <w:tmpl w:val="E88CD9D8"/>
@@ -6401,7 +6293,7 @@
       </w:rPr>
     </w:lvl>
   </w:abstractNum>
-  <w:abstractNum w:abstractNumId="4" w15:restartNumberingAfterBreak="0">
+  <w:abstractNum w:abstractNumId="5" w15:restartNumberingAfterBreak="0">
     <w:nsid w:val="2F7C7108"/>
     <w:multiLevelType w:val="hybridMultilevel"/>
     <w:tmpl w:val="2C426A36"/>
@@ -6514,7 +6406,120 @@
       </w:rPr>
     </w:lvl>
   </w:abstractNum>
-  <w:abstractNum w:abstractNumId="5" w15:restartNumberingAfterBreak="0">
+  <w:abstractNum w:abstractNumId="6" w15:restartNumberingAfterBreak="0">
+    <w:nsid w:val="34990933"/>
+    <w:multiLevelType w:val="hybridMultilevel"/>
+    <w:tmpl w:val="520287EA"/>
+    <w:lvl w:ilvl="0" w:tplc="44090001">
+      <w:start w:val="1"/>
+      <w:numFmt w:val="bullet"/>
+      <w:lvlText w:val=""/>
+      <w:lvlJc w:val="left"/>
+      <w:pPr>
+        <w:ind w:left="720" w:hanging="360"/>
+      </w:pPr>
+      <w:rPr>
+        <w:rFonts w:ascii="Symbol" w:hAnsi="Symbol" w:hint="default"/>
+      </w:rPr>
+    </w:lvl>
+    <w:lvl w:ilvl="1" w:tplc="44090003" w:tentative="1">
+      <w:start w:val="1"/>
+      <w:numFmt w:val="bullet"/>
+      <w:lvlText w:val="o"/>
+      <w:lvlJc w:val="left"/>
+      <w:pPr>
+        <w:ind w:left="1440" w:hanging="360"/>
+      </w:pPr>
+      <w:rPr>
+        <w:rFonts w:ascii="Courier New" w:hAnsi="Courier New" w:cs="Courier New" w:hint="default"/>
+      </w:rPr>
+    </w:lvl>
+    <w:lvl w:ilvl="2" w:tplc="44090005" w:tentative="1">
+      <w:start w:val="1"/>
+      <w:numFmt w:val="bullet"/>
+      <w:lvlText w:val=""/>
+      <w:lvlJc w:val="left"/>
+      <w:pPr>
+        <w:ind w:left="2160" w:hanging="360"/>
+      </w:pPr>
+      <w:rPr>
+        <w:rFonts w:ascii="Wingdings" w:hAnsi="Wingdings" w:hint="default"/>
+      </w:rPr>
+    </w:lvl>
+    <w:lvl w:ilvl="3" w:tplc="44090001" w:tentative="1">
+      <w:start w:val="1"/>
+      <w:numFmt w:val="bullet"/>
+      <w:lvlText w:val=""/>
+      <w:lvlJc w:val="left"/>
+      <w:pPr>
+        <w:ind w:left="2880" w:hanging="360"/>
+      </w:pPr>
+      <w:rPr>
+        <w:rFonts w:ascii="Symbol" w:hAnsi="Symbol" w:hint="default"/>
+      </w:rPr>
+    </w:lvl>
+    <w:lvl w:ilvl="4" w:tplc="44090003" w:tentative="1">
+      <w:start w:val="1"/>
+      <w:numFmt w:val="bullet"/>
+      <w:lvlText w:val="o"/>
+      <w:lvlJc w:val="left"/>
+      <w:pPr>
+        <w:ind w:left="3600" w:hanging="360"/>
+      </w:pPr>
+      <w:rPr>
+        <w:rFonts w:ascii="Courier New" w:hAnsi="Courier New" w:cs="Courier New" w:hint="default"/>
+      </w:rPr>
+    </w:lvl>
+    <w:lvl w:ilvl="5" w:tplc="44090005" w:tentative="1">
+      <w:start w:val="1"/>
+      <w:numFmt w:val="bullet"/>
+      <w:lvlText w:val=""/>
+      <w:lvlJc w:val="left"/>
+      <w:pPr>
+        <w:ind w:left="4320" w:hanging="360"/>
+      </w:pPr>
+      <w:rPr>
+        <w:rFonts w:ascii="Wingdings" w:hAnsi="Wingdings" w:hint="default"/>
+      </w:rPr>
+    </w:lvl>
+    <w:lvl w:ilvl="6" w:tplc="44090001" w:tentative="1">
+      <w:start w:val="1"/>
+      <w:numFmt w:val="bullet"/>
+      <w:lvlText w:val=""/>
+      <w:lvlJc w:val="left"/>
+      <w:pPr>
+        <w:ind w:left="5040" w:hanging="360"/>
+      </w:pPr>
+      <w:rPr>
+        <w:rFonts w:ascii="Symbol" w:hAnsi="Symbol" w:hint="default"/>
+      </w:rPr>
+    </w:lvl>
+    <w:lvl w:ilvl="7" w:tplc="44090003" w:tentative="1">
+      <w:start w:val="1"/>
+      <w:numFmt w:val="bullet"/>
+      <w:lvlText w:val="o"/>
+      <w:lvlJc w:val="left"/>
+      <w:pPr>
+        <w:ind w:left="5760" w:hanging="360"/>
+      </w:pPr>
+      <w:rPr>
+        <w:rFonts w:ascii="Courier New" w:hAnsi="Courier New" w:cs="Courier New" w:hint="default"/>
+      </w:rPr>
+    </w:lvl>
+    <w:lvl w:ilvl="8" w:tplc="44090005" w:tentative="1">
+      <w:start w:val="1"/>
+      <w:numFmt w:val="bullet"/>
+      <w:lvlText w:val=""/>
+      <w:lvlJc w:val="left"/>
+      <w:pPr>
+        <w:ind w:left="6480" w:hanging="360"/>
+      </w:pPr>
+      <w:rPr>
+        <w:rFonts w:ascii="Wingdings" w:hAnsi="Wingdings" w:hint="default"/>
+      </w:rPr>
+    </w:lvl>
+  </w:abstractNum>
+  <w:abstractNum w:abstractNumId="7" w15:restartNumberingAfterBreak="0">
     <w:nsid w:val="3595605C"/>
     <w:multiLevelType w:val="multilevel"/>
     <w:tmpl w:val="E1D2C678"/>
@@ -6663,11 +6668,11 @@
       </w:rPr>
     </w:lvl>
   </w:abstractNum>
-  <w:abstractNum w:abstractNumId="6" w15:restartNumberingAfterBreak="0">
+  <w:abstractNum w:abstractNumId="8" w15:restartNumberingAfterBreak="0">
     <w:nsid w:val="3C913B24"/>
     <w:multiLevelType w:val="hybridMultilevel"/>
-    <w:tmpl w:val="12B61A26"/>
-    <w:lvl w:ilvl="0" w:tplc="85605CBC">
+    <w:tmpl w:val="12D4C1AA"/>
+    <w:lvl w:ilvl="0" w:tplc="F17CC386">
       <w:start w:val="1"/>
       <w:numFmt w:val="decimal"/>
       <w:lvlText w:val="%1."/>
@@ -6677,8 +6682,7 @@
       </w:pPr>
       <w:rPr>
         <w:rFonts w:ascii="Times New Roman" w:hAnsi="Times New Roman" w:hint="default"/>
-        <w:b w:val="0"/>
-        <w:bCs/>
+        <w:b/>
         <w:i w:val="0"/>
         <w:sz w:val="20"/>
       </w:rPr>
@@ -6756,7 +6760,7 @@
       </w:pPr>
     </w:lvl>
   </w:abstractNum>
-  <w:abstractNum w:abstractNumId="7" w15:restartNumberingAfterBreak="0">
+  <w:abstractNum w:abstractNumId="9" w15:restartNumberingAfterBreak="0">
     <w:nsid w:val="48AB1242"/>
     <w:multiLevelType w:val="hybridMultilevel"/>
     <w:tmpl w:val="E27AF31A"/>
@@ -6846,7 +6850,7 @@
       </w:pPr>
     </w:lvl>
   </w:abstractNum>
-  <w:abstractNum w:abstractNumId="8" w15:restartNumberingAfterBreak="0">
+  <w:abstractNum w:abstractNumId="10" w15:restartNumberingAfterBreak="0">
     <w:nsid w:val="5FEF291B"/>
     <w:multiLevelType w:val="multilevel"/>
     <w:tmpl w:val="569E8422"/>
@@ -6995,7 +6999,7 @@
       </w:rPr>
     </w:lvl>
   </w:abstractNum>
-  <w:abstractNum w:abstractNumId="9" w15:restartNumberingAfterBreak="0">
+  <w:abstractNum w:abstractNumId="11" w15:restartNumberingAfterBreak="0">
     <w:nsid w:val="6979039D"/>
     <w:multiLevelType w:val="multilevel"/>
     <w:tmpl w:val="8F505D5E"/>
@@ -7109,33 +7113,39 @@
     </w:lvl>
   </w:abstractNum>
   <w:num w:numId="1" w16cid:durableId="831725241">
+    <w:abstractNumId w:val="10"/>
+  </w:num>
+  <w:num w:numId="2" w16cid:durableId="1411387576">
+    <w:abstractNumId w:val="7"/>
+  </w:num>
+  <w:num w:numId="3" w16cid:durableId="807357141">
+    <w:abstractNumId w:val="11"/>
+  </w:num>
+  <w:num w:numId="4" w16cid:durableId="185487365">
+    <w:abstractNumId w:val="4"/>
+  </w:num>
+  <w:num w:numId="5" w16cid:durableId="2029091102">
     <w:abstractNumId w:val="8"/>
   </w:num>
-  <w:num w:numId="2" w16cid:durableId="1411387576">
-    <w:abstractNumId w:val="5"/>
-  </w:num>
-  <w:num w:numId="3" w16cid:durableId="807357141">
+  <w:num w:numId="6" w16cid:durableId="1328441261">
     <w:abstractNumId w:val="9"/>
   </w:num>
-  <w:num w:numId="4" w16cid:durableId="185487365">
-    <w:abstractNumId w:val="3"/>
-  </w:num>
-  <w:num w:numId="5" w16cid:durableId="2029091102">
-    <w:abstractNumId w:val="6"/>
-  </w:num>
-  <w:num w:numId="6" w16cid:durableId="1328441261">
-    <w:abstractNumId w:val="7"/>
-  </w:num>
   <w:num w:numId="7" w16cid:durableId="1690643089">
-    <w:abstractNumId w:val="4"/>
+    <w:abstractNumId w:val="5"/>
   </w:num>
   <w:num w:numId="8" w16cid:durableId="1870413470">
     <w:abstractNumId w:val="0"/>
   </w:num>
   <w:num w:numId="9" w16cid:durableId="1722750940">
+    <w:abstractNumId w:val="3"/>
+  </w:num>
+  <w:num w:numId="10" w16cid:durableId="871303161">
     <w:abstractNumId w:val="2"/>
   </w:num>
-  <w:num w:numId="10" w16cid:durableId="871303161">
+  <w:num w:numId="11" w16cid:durableId="434711695">
+    <w:abstractNumId w:val="6"/>
+  </w:num>
+  <w:num w:numId="12" w16cid:durableId="1179127197">
     <w:abstractNumId w:val="1"/>
   </w:num>
 </w:numbering>
@@ -7962,32 +7972,18 @@
   <w:rsids>
     <w:rsidRoot w:val="00F92E03"/>
     <w:rsid w:val="000541CA"/>
-    <w:rsid w:val="00070AB3"/>
-    <w:rsid w:val="00130458"/>
     <w:rsid w:val="00165D45"/>
     <w:rsid w:val="001A270B"/>
-    <w:rsid w:val="00243AB9"/>
     <w:rsid w:val="0027425D"/>
-    <w:rsid w:val="002D66F2"/>
-    <w:rsid w:val="003A7054"/>
     <w:rsid w:val="003A7F38"/>
     <w:rsid w:val="003E6BB6"/>
     <w:rsid w:val="003F7B72"/>
-    <w:rsid w:val="00495134"/>
-    <w:rsid w:val="005615B4"/>
-    <w:rsid w:val="00782E67"/>
+    <w:rsid w:val="004E369B"/>
     <w:rsid w:val="00846EF9"/>
-    <w:rsid w:val="008D7EB2"/>
     <w:rsid w:val="008E6145"/>
-    <w:rsid w:val="0092355C"/>
-    <w:rsid w:val="009434CE"/>
-    <w:rsid w:val="009F1D35"/>
     <w:rsid w:val="00A12926"/>
-    <w:rsid w:val="00AC6C43"/>
-    <w:rsid w:val="00C63EFE"/>
+    <w:rsid w:val="00B02CB6"/>
     <w:rsid w:val="00D05AB7"/>
-    <w:rsid w:val="00D34F04"/>
-    <w:rsid w:val="00E37144"/>
     <w:rsid w:val="00EB0953"/>
     <w:rsid w:val="00F92E03"/>
   </w:rsids>

</xml_diff>